<commit_message>
ATU 10 - GERADOR DE DOCS OK
</commit_message>
<xml_diff>
--- a/public/moldes-word/consolidada-rural-pronaf.docx
+++ b/public/moldes-word/consolidada-rural-pronaf.docx
@@ -133,6 +133,16 @@
     <w:p>
       <w:pPr>
         <w:pStyle w:val="NormalWeb"/>
+        <w:jc w:val="both"/>
+        <w:rPr>
+          <w:sz w:val="22"/>
+          <w:szCs w:val="22"/>
+        </w:rPr>
+      </w:pPr>
+    </w:p>
+    <w:p>
+      <w:pPr>
+        <w:pStyle w:val="NormalWeb"/>
         <w:jc w:val="center"/>
       </w:pPr>
       <w:r>
@@ -149,6 +159,10 @@
       <w:pPr>
         <w:pStyle w:val="NormalWeb"/>
         <w:jc w:val="both"/>
+        <w:rPr>
+          <w:sz w:val="22"/>
+          <w:szCs w:val="22"/>
+        </w:rPr>
       </w:pPr>
       <w:r>
         <w:rPr>
@@ -220,6 +234,12 @@
         </w:rPr>
         <w:t>, a seu critério, as despesas inerentes ao estudo de proposta, avaliação patrimonial, IOF, tarifas, ressarcimento, quando permitido, de despesas de fiscalização ou medições de lavoura etc. referentes à contratação de suas operações de crédito, bem como registros cartorários, honorários advocatícios, prêmios de seguros de bens oferecidos em garantia, além da amortização de parcelas de principal e de encargos, incluindo multa e mora de todas as suas operações contratadas com essa Instituição Financeira.</w:t>
       </w:r>
+    </w:p>
+    <w:p>
+      <w:pPr>
+        <w:pStyle w:val="NormalWeb"/>
+        <w:jc w:val="both"/>
+      </w:pPr>
     </w:p>
     <w:p>
       <w:pPr>
@@ -268,6 +288,7 @@
         <w:pStyle w:val="NormalWeb"/>
         <w:jc w:val="both"/>
       </w:pPr>
+      <w:proofErr w:type="gramStart"/>
       <w:r>
         <w:rPr>
           <w:sz w:val="22"/>
@@ -282,6 +303,7 @@
         </w:rPr>
         <w:t>x</w:t>
       </w:r>
+      <w:proofErr w:type="gramEnd"/>
       <w:r>
         <w:rPr>
           <w:sz w:val="22"/>
@@ -300,7 +322,23 @@
           <w:sz w:val="22"/>
           <w:szCs w:val="22"/>
         </w:rPr>
-        <w:t>a)  Todos e quaisquer débitos e responsabilidades decorrentes de quaisquer operações com características de crédito realizadas pelo cliente junto a este banco, demais instituições financeiras ou empresas a ele ligadas e/ou por ele controladas, bem como seus sucessores, serão registrados no Sistema de Informações de Créditos (SCR) administrado pelo Banco Central do Brasil (BACEN) e também nos eventuais sistemas que venham a substituir ou a complementar o SCR;</w:t>
+        <w:t xml:space="preserve">a)  Todos e quaisquer débitos e responsabilidades decorrentes de quaisquer operações com características de crédito realizadas pelo cliente junto a este banco, demais instituições financeiras ou empresas a ele ligadas e/ou por ele controladas, bem como seus sucessores, serão registrados no Sistema de Informações de Créditos (SCR) administrado pelo Banco Central do Brasil (BACEN) </w:t>
+      </w:r>
+      <w:proofErr w:type="gramStart"/>
+      <w:r>
+        <w:rPr>
+          <w:sz w:val="22"/>
+          <w:szCs w:val="22"/>
+        </w:rPr>
+        <w:t>e também</w:t>
+      </w:r>
+      <w:proofErr w:type="gramEnd"/>
+      <w:r>
+        <w:rPr>
+          <w:sz w:val="22"/>
+          <w:szCs w:val="22"/>
+        </w:rPr>
+        <w:t xml:space="preserve"> nos eventuais sistemas que venham a substituir ou a complementar o SCR;</w:t>
       </w:r>
     </w:p>
     <w:p>
@@ -352,6 +390,7 @@
           <w:sz w:val="22"/>
           <w:szCs w:val="22"/>
         </w:rPr>
+        <w:lastRenderedPageBreak/>
         <w:t>c)  O cliente poderá ter acesso aos dados constantes em seu nome no SCR, por meio do Registrato - Extrato do Registro de Informações no BACEN ou da Central de Atendimento ao Público do BACEN;</w:t>
       </w:r>
     </w:p>
@@ -365,15 +404,7 @@
           <w:sz w:val="22"/>
           <w:szCs w:val="22"/>
         </w:rPr>
-        <w:t xml:space="preserve">d)  As manifestações de discordância quanto às informações constantes do SCR e os pedidos de correções, exclusões e registros de medidas judiciais no SCR deverão ser dirigidos a este banco, </w:t>
-      </w:r>
-      <w:r>
-        <w:rPr>
-          <w:sz w:val="22"/>
-          <w:szCs w:val="22"/>
-        </w:rPr>
-        <w:lastRenderedPageBreak/>
-        <w:t>por meio de requerimento escrito e fundamentado do cliente, acompanhado da respectiva decisão judicial, quando for o caso;</w:t>
+        <w:t>d)  As manifestações de discordância quanto às informações constantes do SCR e os pedidos de correções, exclusões e registros de medidas judiciais no SCR deverão ser dirigidos a este banco, por meio de requerimento escrito e fundamentado do cliente, acompanhado da respectiva decisão judicial, quando for o caso;</w:t>
       </w:r>
     </w:p>
     <w:p>
@@ -392,6 +423,16 @@
         </w:rPr>
         <w:t>e)  A consulta sobre qualquer informação constante do SCR pelas instituições autorizadas pelo BACEN dependerá da prévia autorização do cliente de operações de crédito.</w:t>
       </w:r>
+    </w:p>
+    <w:p>
+      <w:pPr>
+        <w:pStyle w:val="NormalWeb"/>
+        <w:jc w:val="both"/>
+        <w:rPr>
+          <w:sz w:val="22"/>
+          <w:szCs w:val="22"/>
+        </w:rPr>
+      </w:pPr>
     </w:p>
     <w:p>
       <w:pPr>
@@ -465,6 +506,12 @@
     <w:p>
       <w:pPr>
         <w:pStyle w:val="NormalWeb"/>
+        <w:jc w:val="both"/>
+      </w:pPr>
+    </w:p>
+    <w:p>
+      <w:pPr>
+        <w:pStyle w:val="NormalWeb"/>
         <w:jc w:val="center"/>
       </w:pPr>
       <w:r>
@@ -482,6 +529,7 @@
         <w:pStyle w:val="NormalWeb"/>
         <w:jc w:val="both"/>
       </w:pPr>
+      <w:proofErr w:type="gramStart"/>
       <w:r>
         <w:rPr>
           <w:sz w:val="22"/>
@@ -494,7 +542,15 @@
           <w:sz w:val="22"/>
           <w:szCs w:val="22"/>
         </w:rPr>
-        <w:t xml:space="preserve">x </w:t>
+        <w:t>x</w:t>
+      </w:r>
+      <w:proofErr w:type="gramEnd"/>
+      <w:r>
+        <w:rPr>
+          <w:sz w:val="22"/>
+          <w:szCs w:val="22"/>
+        </w:rPr>
+        <w:t xml:space="preserve"> </w:t>
       </w:r>
       <w:r>
         <w:rPr>
@@ -508,14 +564,25 @@
       <w:pPr>
         <w:pStyle w:val="NormalWeb"/>
         <w:jc w:val="both"/>
-      </w:pPr>
-      <w:r>
-        <w:rPr>
-          <w:sz w:val="22"/>
-          <w:szCs w:val="22"/>
-        </w:rPr>
+        <w:rPr>
+          <w:sz w:val="22"/>
+          <w:szCs w:val="22"/>
+        </w:rPr>
+      </w:pPr>
+      <w:r>
+        <w:rPr>
+          <w:sz w:val="22"/>
+          <w:szCs w:val="22"/>
+        </w:rPr>
+        <w:lastRenderedPageBreak/>
         <w:t>E que está ciente de que a falsidade da declaração ora prestada acarretará o vencimento antecipado dos instrumentos contratuais, nos quais se formalizarem a concessão de crédito por parte do Banco do Nordeste do Brasil S.A. sem prejuízo da aplicação das sanções legais cabíveis, de natureza civil e penal.</w:t>
       </w:r>
+    </w:p>
+    <w:p>
+      <w:pPr>
+        <w:pStyle w:val="NormalWeb"/>
+        <w:jc w:val="both"/>
+      </w:pPr>
     </w:p>
     <w:p>
       <w:pPr>
@@ -536,7 +603,12 @@
       <w:pPr>
         <w:pStyle w:val="NormalWeb"/>
         <w:jc w:val="both"/>
-      </w:pPr>
+        <w:rPr>
+          <w:sz w:val="22"/>
+          <w:szCs w:val="22"/>
+        </w:rPr>
+      </w:pPr>
+      <w:proofErr w:type="gramStart"/>
       <w:r>
         <w:rPr>
           <w:sz w:val="22"/>
@@ -551,6 +623,7 @@
         </w:rPr>
         <w:t>x</w:t>
       </w:r>
+      <w:proofErr w:type="gramEnd"/>
       <w:r>
         <w:rPr>
           <w:sz w:val="22"/>
@@ -572,16 +645,14 @@
           <w:sz w:val="22"/>
           <w:szCs w:val="22"/>
         </w:rPr>
-        <w:t xml:space="preserve">. 7º, I e 8º, caput e § 4º, da Lei nº 13.709/2018, autoriza(m) o Banco do </w:t>
-      </w:r>
-      <w:r>
-        <w:rPr>
-          <w:sz w:val="22"/>
-          <w:szCs w:val="22"/>
-        </w:rPr>
-        <w:lastRenderedPageBreak/>
-        <w:t>Nordeste do Brasil S.A., a fornecer à CAMED Administradora e Corretora de Seguros Ltda, CNPJ 07.202.740/0001-50, os dados e as informações necessárias à cotação, contratação e renovação de seguro dos nossos bens patrimoniais oferecidos em garantia em operações de crédito com o Banco do Nordeste, ressalvando, entretanto, que futura obrigação sua de contratar ou renovar seguro desses bens poderá ser cumprida por intermédio dessa ou de outra corretora de sua conveniência.</w:t>
-      </w:r>
+        <w:t>. 7º, I e 8º, caput e § 4º, da Lei nº 13.709/2018, autoriza(m) o Banco do Nordeste do Brasil S.A., a fornecer à CAMED Administradora e Corretora de Seguros Ltda, CNPJ 07.202.740/0001-50, os dados e as informações necessárias à cotação, contratação e renovação de seguro dos nossos bens patrimoniais oferecidos em garantia em operações de crédito com o Banco do Nordeste, ressalvando, entretanto, que futura obrigação sua de contratar ou renovar seguro desses bens poderá ser cumprida por intermédio dessa ou de outra corretora de sua conveniência.</w:t>
+      </w:r>
+    </w:p>
+    <w:p>
+      <w:pPr>
+        <w:pStyle w:val="NormalWeb"/>
+        <w:jc w:val="both"/>
+      </w:pPr>
     </w:p>
     <w:p>
       <w:pPr>
@@ -603,6 +674,7 @@
         <w:pStyle w:val="NormalWeb"/>
         <w:jc w:val="both"/>
       </w:pPr>
+      <w:proofErr w:type="gramStart"/>
       <w:r>
         <w:rPr>
           <w:sz w:val="22"/>
@@ -617,6 +689,7 @@
         </w:rPr>
         <w:t>x</w:t>
       </w:r>
+      <w:proofErr w:type="gramEnd"/>
       <w:r>
         <w:rPr>
           <w:sz w:val="22"/>
@@ -646,12 +719,21 @@
         <w:pStyle w:val="NormalWeb"/>
         <w:jc w:val="both"/>
       </w:pPr>
-      <w:r>
-        <w:rPr>
-          <w:sz w:val="22"/>
-          <w:szCs w:val="22"/>
-        </w:rPr>
-        <w:t xml:space="preserve">(  )   Na qualidade de beneficiário(a) de financiamento com recursos do Fundo Constitucional de Financiamento do Nordeste (FNE), </w:t>
+      <w:proofErr w:type="gramStart"/>
+      <w:r>
+        <w:rPr>
+          <w:sz w:val="22"/>
+          <w:szCs w:val="22"/>
+        </w:rPr>
+        <w:t>(  )</w:t>
+      </w:r>
+      <w:proofErr w:type="gramEnd"/>
+      <w:r>
+        <w:rPr>
+          <w:sz w:val="22"/>
+          <w:szCs w:val="22"/>
+        </w:rPr>
+        <w:t xml:space="preserve">   Na qualidade de beneficiário(a) de financiamento com recursos do Fundo Constitucional de Financiamento do Nordeste (FNE), </w:t>
       </w:r>
       <w:r>
         <w:rPr>
@@ -691,12 +773,21 @@
         <w:pStyle w:val="NormalWeb"/>
         <w:jc w:val="both"/>
       </w:pPr>
-      <w:r>
-        <w:rPr>
-          <w:sz w:val="22"/>
-          <w:szCs w:val="22"/>
-        </w:rPr>
-        <w:t>(  )   Na qualidade de beneficiário(a) de financiamento com recursos do Fundo Constitucional de Financiamento do Nordeste (FNE), e de controlador(a) da empresa (</w:t>
+      <w:proofErr w:type="gramStart"/>
+      <w:r>
+        <w:rPr>
+          <w:sz w:val="22"/>
+          <w:szCs w:val="22"/>
+        </w:rPr>
+        <w:t>(  )</w:t>
+      </w:r>
+      <w:proofErr w:type="gramEnd"/>
+      <w:r>
+        <w:rPr>
+          <w:sz w:val="22"/>
+          <w:szCs w:val="22"/>
+        </w:rPr>
+        <w:t>   Na qualidade de beneficiário(a) de financiamento com recursos do Fundo Constitucional de Financiamento do Nordeste (FNE), e de controlador(a) da empresa (</w:t>
       </w:r>
       <w:r>
         <w:rPr>
@@ -941,12 +1032,21 @@
         <w:pStyle w:val="NormalWeb"/>
         <w:jc w:val="both"/>
       </w:pPr>
-      <w:r>
-        <w:rPr>
-          <w:sz w:val="22"/>
-          <w:szCs w:val="22"/>
-        </w:rPr>
-        <w:t>(  )   Na qualidade de controlador(a) da empresa (</w:t>
+      <w:proofErr w:type="gramStart"/>
+      <w:r>
+        <w:rPr>
+          <w:sz w:val="22"/>
+          <w:szCs w:val="22"/>
+        </w:rPr>
+        <w:t>(  )</w:t>
+      </w:r>
+      <w:proofErr w:type="gramEnd"/>
+      <w:r>
+        <w:rPr>
+          <w:sz w:val="22"/>
+          <w:szCs w:val="22"/>
+        </w:rPr>
+        <w:t>   Na qualidade de controlador(a) da empresa (</w:t>
       </w:r>
       <w:r>
         <w:rPr>
@@ -1049,13 +1149,26 @@
       <w:pPr>
         <w:pStyle w:val="NormalWeb"/>
         <w:jc w:val="both"/>
-      </w:pPr>
-      <w:r>
-        <w:rPr>
-          <w:sz w:val="22"/>
-          <w:szCs w:val="22"/>
-        </w:rPr>
-        <w:t>(  )   Na qualidade de controlador(a) da empresa (</w:t>
+        <w:rPr>
+          <w:sz w:val="22"/>
+          <w:szCs w:val="22"/>
+        </w:rPr>
+      </w:pPr>
+      <w:proofErr w:type="gramStart"/>
+      <w:r>
+        <w:rPr>
+          <w:sz w:val="22"/>
+          <w:szCs w:val="22"/>
+        </w:rPr>
+        <w:t>(  )</w:t>
+      </w:r>
+      <w:proofErr w:type="gramEnd"/>
+      <w:r>
+        <w:rPr>
+          <w:sz w:val="22"/>
+          <w:szCs w:val="22"/>
+        </w:rPr>
+        <w:t>   Na qualidade de controlador(a) da empresa (</w:t>
       </w:r>
       <w:r>
         <w:rPr>
@@ -1111,6 +1224,7 @@
           <w:sz w:val="22"/>
           <w:szCs w:val="22"/>
         </w:rPr>
+        <w:lastRenderedPageBreak/>
         <w:t>xx.xxx.xxx</w:t>
       </w:r>
       <w:proofErr w:type="spellEnd"/>
@@ -1189,6 +1303,12 @@
     <w:p>
       <w:pPr>
         <w:pStyle w:val="NormalWeb"/>
+        <w:jc w:val="both"/>
+      </w:pPr>
+    </w:p>
+    <w:p>
+      <w:pPr>
+        <w:pStyle w:val="NormalWeb"/>
         <w:jc w:val="center"/>
       </w:pPr>
       <w:r>
@@ -1222,6 +1342,7 @@
         <w:t>chk_reneg_nao</w:t>
       </w:r>
       <w:proofErr w:type="spellEnd"/>
+      <w:proofErr w:type="gramStart"/>
       <w:r>
         <w:rPr>
           <w:sz w:val="22"/>
@@ -1234,13 +1355,41 @@
           <w:sz w:val="22"/>
           <w:szCs w:val="22"/>
         </w:rPr>
-        <w:t>   Não responde(m) por nenhuma operação de crédito rural para investimento renegociada nos termos do artigos 15, 29 ou 30 da Medida Provisória nº 432 de 27/05/2008 e nos termos dos artigos 15, 29 ou 30 da Lei nº 11.775 de 17/09/2008, regulamentados, respectivamente, pelas Resoluções nº 3.578 e nº 3.573, ambas de 29/05/2008, do Conselho Monetário Nacional.</w:t>
-      </w:r>
-    </w:p>
-    <w:p>
-      <w:pPr>
-        <w:pStyle w:val="NormalWeb"/>
-        <w:jc w:val="both"/>
+        <w:t xml:space="preserve">   </w:t>
+      </w:r>
+      <w:proofErr w:type="gramEnd"/>
+      <w:r>
+        <w:rPr>
+          <w:sz w:val="22"/>
+          <w:szCs w:val="22"/>
+        </w:rPr>
+        <w:t xml:space="preserve">Não responde(m) por nenhuma operação de crédito rural para investimento renegociada nos termos </w:t>
+      </w:r>
+      <w:proofErr w:type="gramStart"/>
+      <w:r>
+        <w:rPr>
+          <w:sz w:val="22"/>
+          <w:szCs w:val="22"/>
+        </w:rPr>
+        <w:t>do artigos</w:t>
+      </w:r>
+      <w:proofErr w:type="gramEnd"/>
+      <w:r>
+        <w:rPr>
+          <w:sz w:val="22"/>
+          <w:szCs w:val="22"/>
+        </w:rPr>
+        <w:t xml:space="preserve"> 15, 29 ou 30 da Medida Provisória nº 432 de 27/05/2008 e nos termos dos artigos 15, 29 ou 30 da Lei nº 11.775 de 17/09/2008, regulamentados, respectivamente, pelas Resoluções nº 3.578 e nº 3.573, ambas de 29/05/2008, do Conselho Monetário Nacional.</w:t>
+      </w:r>
+    </w:p>
+    <w:p>
+      <w:pPr>
+        <w:pStyle w:val="NormalWeb"/>
+        <w:jc w:val="both"/>
+        <w:rPr>
+          <w:sz w:val="22"/>
+          <w:szCs w:val="22"/>
+        </w:rPr>
       </w:pPr>
       <w:r>
         <w:rPr>
@@ -1258,6 +1407,7 @@
         <w:t>chk_reneg_pagas</w:t>
       </w:r>
       <w:proofErr w:type="spellEnd"/>
+      <w:proofErr w:type="gramStart"/>
       <w:r>
         <w:rPr>
           <w:sz w:val="22"/>
@@ -1270,7 +1420,15 @@
           <w:sz w:val="22"/>
           <w:szCs w:val="22"/>
         </w:rPr>
-        <w:t xml:space="preserve">   Já amortizou(aram) integralmente as prestações vencidas no ano de </w:t>
+        <w:t xml:space="preserve">   </w:t>
+      </w:r>
+      <w:proofErr w:type="gramEnd"/>
+      <w:r>
+        <w:rPr>
+          <w:sz w:val="22"/>
+          <w:szCs w:val="22"/>
+        </w:rPr>
+        <w:t xml:space="preserve">Já amortizou(aram) integralmente as prestações vencidas no ano de </w:t>
       </w:r>
       <w:r>
         <w:rPr>
@@ -1286,16 +1444,30 @@
           <w:sz w:val="22"/>
           <w:szCs w:val="22"/>
         </w:rPr>
-        <w:t xml:space="preserve"> da operação de crédito rural para investimento </w:t>
-      </w:r>
-      <w:r>
-        <w:rPr>
-          <w:sz w:val="22"/>
-          <w:szCs w:val="22"/>
-        </w:rPr>
-        <w:lastRenderedPageBreak/>
-        <w:t>renegociada nos termos do artigos 15, 29 ou 30 da Medida Provisória nº 432 de 27/05/2008 e nos termos dos artigos 15, 29 ou 30 da Lei nº 11.775 de 17/09/2008, regulamentados, respectivamente, pelas Resoluções nº 3.578 e nº 3.573, ambas de 29/05/2008, do Conselho Monetário Nacional.</w:t>
-      </w:r>
+        <w:t xml:space="preserve"> da operação de crédito rural para investimento renegociada nos termos </w:t>
+      </w:r>
+      <w:proofErr w:type="gramStart"/>
+      <w:r>
+        <w:rPr>
+          <w:sz w:val="22"/>
+          <w:szCs w:val="22"/>
+        </w:rPr>
+        <w:t>do artigos</w:t>
+      </w:r>
+      <w:proofErr w:type="gramEnd"/>
+      <w:r>
+        <w:rPr>
+          <w:sz w:val="22"/>
+          <w:szCs w:val="22"/>
+        </w:rPr>
+        <w:t xml:space="preserve"> 15, 29 ou 30 da Medida Provisória nº 432 de 27/05/2008 e nos termos dos artigos 15, 29 ou 30 da Lei nº 11.775 de 17/09/2008, regulamentados, respectivamente, pelas Resoluções nº 3.578 e nº 3.573, ambas de 29/05/2008, do Conselho Monetário Nacional.</w:t>
+      </w:r>
+    </w:p>
+    <w:p>
+      <w:pPr>
+        <w:pStyle w:val="NormalWeb"/>
+        <w:jc w:val="both"/>
+      </w:pPr>
     </w:p>
     <w:p>
       <w:pPr>
@@ -1316,7 +1488,12 @@
       <w:pPr>
         <w:pStyle w:val="NormalWeb"/>
         <w:jc w:val="both"/>
-      </w:pPr>
+        <w:rPr>
+          <w:sz w:val="22"/>
+          <w:szCs w:val="22"/>
+        </w:rPr>
+      </w:pPr>
+      <w:proofErr w:type="gramStart"/>
       <w:r>
         <w:rPr>
           <w:sz w:val="22"/>
@@ -1331,6 +1508,7 @@
         </w:rPr>
         <w:t>x</w:t>
       </w:r>
+      <w:proofErr w:type="gramEnd"/>
       <w:r>
         <w:rPr>
           <w:sz w:val="22"/>
@@ -1338,6 +1516,12 @@
         </w:rPr>
         <w:t xml:space="preserve"> )   Não transitará em vias públicas com o trator ou os demais aparelhos automotores destinados a arrastar maquinaria de qualquer natureza ou executar trabalhos de construção ou de pavimentação adquiridos por meio do financiamento do Banco do Nordeste do Brasil S/A.</w:t>
       </w:r>
+    </w:p>
+    <w:p>
+      <w:pPr>
+        <w:pStyle w:val="NormalWeb"/>
+        <w:jc w:val="both"/>
+      </w:pPr>
     </w:p>
     <w:p>
       <w:pPr>
@@ -1351,299 +1535,9 @@
           <w:sz w:val="22"/>
           <w:szCs w:val="22"/>
         </w:rPr>
-        <w:t>Declaração de Não Contribuinte à Previdência Social como Empregador</w:t>
-      </w:r>
-    </w:p>
-    <w:p>
-      <w:pPr>
-        <w:pStyle w:val="NormalWeb"/>
-        <w:jc w:val="both"/>
-      </w:pPr>
-      <w:r>
-        <w:rPr>
-          <w:sz w:val="22"/>
-          <w:szCs w:val="22"/>
-        </w:rPr>
-        <w:t>({</w:t>
-      </w:r>
-      <w:proofErr w:type="spellStart"/>
-      <w:r>
-        <w:rPr>
-          <w:sz w:val="22"/>
-          <w:szCs w:val="22"/>
-        </w:rPr>
-        <w:t>chk_prev_rur</w:t>
-      </w:r>
-      <w:proofErr w:type="spellEnd"/>
-      <w:r>
-        <w:rPr>
-          <w:sz w:val="22"/>
-          <w:szCs w:val="22"/>
-        </w:rPr>
-        <w:t>})</w:t>
-      </w:r>
-      <w:r>
-        <w:rPr>
-          <w:sz w:val="22"/>
-          <w:szCs w:val="22"/>
-        </w:rPr>
-        <w:t>   Não se constitui em empresário registrado na junta comercial, na forma do Código Civil, bem como declara que, com relação ao(s) imóvel(</w:t>
-      </w:r>
-      <w:proofErr w:type="spellStart"/>
-      <w:r>
-        <w:rPr>
-          <w:sz w:val="22"/>
-          <w:szCs w:val="22"/>
-        </w:rPr>
-        <w:t>is</w:t>
-      </w:r>
-      <w:proofErr w:type="spellEnd"/>
-      <w:r>
-        <w:rPr>
-          <w:sz w:val="22"/>
-          <w:szCs w:val="22"/>
-        </w:rPr>
-        <w:t>):</w:t>
-      </w:r>
-    </w:p>
-    <w:p>
-      <w:pPr>
-        <w:pStyle w:val="NormalWeb"/>
-        <w:jc w:val="both"/>
-        <w:rPr>
-          <w:sz w:val="22"/>
-          <w:szCs w:val="22"/>
-        </w:rPr>
-      </w:pPr>
-      <w:r>
-        <w:rPr>
-          <w:sz w:val="22"/>
-          <w:szCs w:val="22"/>
-        </w:rPr>
-        <w:t>{#imoveis}</w:t>
-      </w:r>
-    </w:p>
-    <w:p>
-      <w:pPr>
-        <w:pStyle w:val="NormalWeb"/>
-        <w:jc w:val="both"/>
-        <w:rPr>
-          <w:sz w:val="22"/>
-          <w:szCs w:val="22"/>
-        </w:rPr>
-      </w:pPr>
-      <w:r>
-        <w:rPr>
-          <w:sz w:val="22"/>
-          <w:szCs w:val="22"/>
-        </w:rPr>
-        <w:t>- ({</w:t>
-      </w:r>
-      <w:proofErr w:type="spellStart"/>
-      <w:r>
-        <w:rPr>
-          <w:sz w:val="22"/>
-          <w:szCs w:val="22"/>
-        </w:rPr>
-        <w:t>idx</w:t>
-      </w:r>
-      <w:proofErr w:type="spellEnd"/>
-      <w:r>
-        <w:rPr>
-          <w:sz w:val="22"/>
-          <w:szCs w:val="22"/>
-        </w:rPr>
-        <w:t>}) imóvel denominado {nome}, localizado no município de {cidade} - {estado}, objeto da matrícula nº {matricula};</w:t>
-      </w:r>
-    </w:p>
-    <w:p>
-      <w:pPr>
-        <w:pStyle w:val="NormalWeb"/>
-        <w:jc w:val="both"/>
-        <w:rPr>
-          <w:sz w:val="22"/>
-          <w:szCs w:val="22"/>
-        </w:rPr>
-      </w:pPr>
-      <w:r>
-        <w:rPr>
-          <w:sz w:val="22"/>
-          <w:szCs w:val="22"/>
-        </w:rPr>
-        <w:t>{/</w:t>
-      </w:r>
-      <w:proofErr w:type="spellStart"/>
-      <w:r>
-        <w:rPr>
-          <w:sz w:val="22"/>
-          <w:szCs w:val="22"/>
-        </w:rPr>
-        <w:t>imoveis</w:t>
-      </w:r>
-      <w:proofErr w:type="spellEnd"/>
-      <w:r>
-        <w:rPr>
-          <w:sz w:val="22"/>
-          <w:szCs w:val="22"/>
-        </w:rPr>
-        <w:t>}</w:t>
-      </w:r>
-    </w:p>
-    <w:p>
-      <w:pPr>
-        <w:pStyle w:val="NormalWeb"/>
-        <w:jc w:val="both"/>
-        <w:rPr>
-          <w:sz w:val="22"/>
-          <w:szCs w:val="22"/>
-        </w:rPr>
-      </w:pPr>
-      <w:r>
-        <w:rPr>
-          <w:sz w:val="22"/>
-          <w:szCs w:val="22"/>
-        </w:rPr>
-        <w:t>Não é nem nunca foi contribuinte da Previdência Social na condição de empregador, por não manter nem ter mantido a seu serviço segurado(s) empregado(s) ou trabalhador(es) avulso(s) nesta(s) propriedade(s) rural(</w:t>
-      </w:r>
-      <w:proofErr w:type="spellStart"/>
-      <w:r>
-        <w:rPr>
-          <w:sz w:val="22"/>
-          <w:szCs w:val="22"/>
-        </w:rPr>
-        <w:t>is</w:t>
-      </w:r>
-      <w:proofErr w:type="spellEnd"/>
-      <w:r>
-        <w:rPr>
-          <w:sz w:val="22"/>
-          <w:szCs w:val="22"/>
-        </w:rPr>
-        <w:t>).</w:t>
-      </w:r>
-    </w:p>
-    <w:p>
-      <w:pPr>
-        <w:pStyle w:val="NormalWeb"/>
-        <w:jc w:val="both"/>
-      </w:pPr>
-      <w:r>
-        <w:rPr>
-          <w:sz w:val="22"/>
-          <w:szCs w:val="22"/>
-        </w:rPr>
-        <w:t>Declara, ainda, que, não comercializa a produção por ele obtida no(s) referido(s) imóvel(</w:t>
-      </w:r>
-      <w:proofErr w:type="spellStart"/>
-      <w:r>
-        <w:rPr>
-          <w:sz w:val="22"/>
-          <w:szCs w:val="22"/>
-        </w:rPr>
-        <w:t>is</w:t>
-      </w:r>
-      <w:proofErr w:type="spellEnd"/>
-      <w:r>
-        <w:rPr>
-          <w:sz w:val="22"/>
-          <w:szCs w:val="22"/>
-        </w:rPr>
-        <w:t>) rural(</w:t>
-      </w:r>
-      <w:proofErr w:type="spellStart"/>
-      <w:r>
-        <w:rPr>
-          <w:sz w:val="22"/>
-          <w:szCs w:val="22"/>
-        </w:rPr>
-        <w:t>is</w:t>
-      </w:r>
-      <w:proofErr w:type="spellEnd"/>
-      <w:r>
-        <w:rPr>
-          <w:sz w:val="22"/>
-          <w:szCs w:val="22"/>
-        </w:rPr>
-        <w:t>) com consumidor pessoa física, no varejo; nem com adquirente pessoa física, não produtor rural, para venda no varejo a consumidor pessoa física; nem com outro produtor rural pessoa física; nem com outro segurado especial; nem com empresa adquirente, consumidora, consignatária ou cooperativa; nem comercializou a referida produção, até 12/12/2001, com adquirente domiciliado no exterior (exportação).</w:t>
-      </w:r>
-    </w:p>
-    <w:p>
-      <w:pPr>
-        <w:pStyle w:val="NormalWeb"/>
-        <w:jc w:val="both"/>
-      </w:pPr>
-      <w:r>
-        <w:rPr>
-          <w:sz w:val="22"/>
-          <w:szCs w:val="22"/>
-        </w:rPr>
-        <w:t>({</w:t>
-      </w:r>
-      <w:proofErr w:type="spellStart"/>
-      <w:r>
-        <w:rPr>
-          <w:sz w:val="22"/>
-          <w:szCs w:val="22"/>
-        </w:rPr>
-        <w:t>chk_prev_nenhum</w:t>
-      </w:r>
-      <w:proofErr w:type="spellEnd"/>
-      <w:r>
-        <w:rPr>
-          <w:sz w:val="22"/>
-          <w:szCs w:val="22"/>
-        </w:rPr>
-        <w:t>})</w:t>
-      </w:r>
-      <w:r>
-        <w:rPr>
-          <w:sz w:val="22"/>
-          <w:szCs w:val="22"/>
-        </w:rPr>
-        <w:t>   Não se constitui em empresário registrado na Junta Comercial, na forma do Código Civil, bem como que não é, nem nunca foi, contribuinte da Previdência Social como empregador e que não mantém nem manteve a seu serviço segurados empregados ou trabalhadores avulsos, (e que não comercializa a própria produção, "se produtor rural ou segurado especial", na forma prevista no inciso I do art. 166 da Instrução Normativa RFB nº 971 de 13/11/2009 e respectivas alterações), não estando, portanto, sujeito(a) ao cumprimento da exigência de apresentação de Certidão Negativa de Débito - CND, a que alude o art. 10 da Lei nº 8.870, de 15/04/94, para fins de obtenção de crédito junto ao Banco do Nordeste.</w:t>
-      </w:r>
-    </w:p>
-    <w:p>
-      <w:pPr>
-        <w:pStyle w:val="NormalWeb"/>
-        <w:jc w:val="both"/>
-      </w:pPr>
-      <w:r>
-        <w:rPr>
-          <w:sz w:val="22"/>
-          <w:szCs w:val="22"/>
-        </w:rPr>
-        <w:t>({</w:t>
-      </w:r>
-      <w:proofErr w:type="spellStart"/>
-      <w:r>
-        <w:rPr>
-          <w:sz w:val="22"/>
-          <w:szCs w:val="22"/>
-        </w:rPr>
-        <w:t>chk_prev_emp</w:t>
-      </w:r>
-      <w:proofErr w:type="spellEnd"/>
-      <w:r>
-        <w:rPr>
-          <w:sz w:val="22"/>
-          <w:szCs w:val="22"/>
-        </w:rPr>
-        <w:t>})</w:t>
-      </w:r>
-      <w:r>
-        <w:rPr>
-          <w:sz w:val="22"/>
-          <w:szCs w:val="22"/>
-        </w:rPr>
-        <w:t>   Constitui-se em empresário registrado na Junta Comercial, na forma do Código Civil, e não é, nem nunca foi, contribuinte da Previdência Social como empregador e que não mantém nem manteve a seu serviço segurados empregados ou trabalhadores avulsos, (e que não comercializa a própria produção, "se produtor rural ou segurado especial", na forma prevista no inciso I do art. 166 da Instrução Normativa RFB nº 971 de 13/11/2009 e respectivas alterações), não estando, portanto, sujeito(a) ao cumprimento da exigência de apresentação de Certidão Negativa de Débito - CND, a que alude o art. 10 da Lei nº 8.870, de 15/04/94, para fins de obtenção de crédito junto ao Banco do Nordeste.</w:t>
-      </w:r>
-    </w:p>
-    <w:p>
-      <w:pPr>
-        <w:pStyle w:val="NormalWeb"/>
-        <w:jc w:val="center"/>
-      </w:pPr>
+        <w:t xml:space="preserve">Declaração de Não Contribuinte à Previdência Social </w:t>
+      </w:r>
+      <w:proofErr w:type="gramStart"/>
       <w:r>
         <w:rPr>
           <w:b/>
@@ -1651,7 +1545,246 @@
           <w:sz w:val="22"/>
           <w:szCs w:val="22"/>
         </w:rPr>
-        <w:t>Declaração Referente ao Financiamento de Soja, Milho e Algodão</w:t>
+        <w:t>como Empregador</w:t>
+      </w:r>
+      <w:proofErr w:type="gramEnd"/>
+    </w:p>
+    <w:p>
+      <w:pPr>
+        <w:pStyle w:val="NormalWeb"/>
+        <w:jc w:val="both"/>
+      </w:pPr>
+      <w:r>
+        <w:rPr>
+          <w:sz w:val="22"/>
+          <w:szCs w:val="22"/>
+        </w:rPr>
+        <w:t>({</w:t>
+      </w:r>
+      <w:proofErr w:type="spellStart"/>
+      <w:r>
+        <w:rPr>
+          <w:sz w:val="22"/>
+          <w:szCs w:val="22"/>
+        </w:rPr>
+        <w:t>chk_prev_rur</w:t>
+      </w:r>
+      <w:proofErr w:type="spellEnd"/>
+      <w:proofErr w:type="gramStart"/>
+      <w:r>
+        <w:rPr>
+          <w:sz w:val="22"/>
+          <w:szCs w:val="22"/>
+        </w:rPr>
+        <w:t>})</w:t>
+      </w:r>
+      <w:r>
+        <w:rPr>
+          <w:sz w:val="22"/>
+          <w:szCs w:val="22"/>
+        </w:rPr>
+        <w:t xml:space="preserve">   </w:t>
+      </w:r>
+      <w:proofErr w:type="gramEnd"/>
+      <w:r>
+        <w:rPr>
+          <w:sz w:val="22"/>
+          <w:szCs w:val="22"/>
+        </w:rPr>
+        <w:t>Não se constitui em empresário registrado na junta comercial, na forma do Código Civil, bem como declara que, com relação ao(s) imóvel(</w:t>
+      </w:r>
+      <w:proofErr w:type="spellStart"/>
+      <w:r>
+        <w:rPr>
+          <w:sz w:val="22"/>
+          <w:szCs w:val="22"/>
+        </w:rPr>
+        <w:t>is</w:t>
+      </w:r>
+      <w:proofErr w:type="spellEnd"/>
+      <w:r>
+        <w:rPr>
+          <w:sz w:val="22"/>
+          <w:szCs w:val="22"/>
+        </w:rPr>
+        <w:t>):</w:t>
+      </w:r>
+    </w:p>
+    <w:p>
+      <w:pPr>
+        <w:pStyle w:val="NormalWeb"/>
+        <w:jc w:val="both"/>
+        <w:rPr>
+          <w:sz w:val="22"/>
+          <w:szCs w:val="22"/>
+        </w:rPr>
+      </w:pPr>
+      <w:r>
+        <w:rPr>
+          <w:sz w:val="22"/>
+          <w:szCs w:val="22"/>
+        </w:rPr>
+        <w:t>{#imoveis}</w:t>
+      </w:r>
+    </w:p>
+    <w:p>
+      <w:pPr>
+        <w:pStyle w:val="NormalWeb"/>
+        <w:jc w:val="both"/>
+        <w:rPr>
+          <w:sz w:val="22"/>
+          <w:szCs w:val="22"/>
+        </w:rPr>
+      </w:pPr>
+      <w:r>
+        <w:rPr>
+          <w:sz w:val="22"/>
+          <w:szCs w:val="22"/>
+        </w:rPr>
+        <w:t>- ({</w:t>
+      </w:r>
+      <w:proofErr w:type="spellStart"/>
+      <w:r>
+        <w:rPr>
+          <w:sz w:val="22"/>
+          <w:szCs w:val="22"/>
+        </w:rPr>
+        <w:t>idx</w:t>
+      </w:r>
+      <w:proofErr w:type="spellEnd"/>
+      <w:r>
+        <w:rPr>
+          <w:sz w:val="22"/>
+          <w:szCs w:val="22"/>
+        </w:rPr>
+        <w:t>}) imóvel denominado {nome}, localizado no município de {cidade} - {estado}, objeto da matrícula nº {</w:t>
+      </w:r>
+      <w:proofErr w:type="gramStart"/>
+      <w:r>
+        <w:rPr>
+          <w:sz w:val="22"/>
+          <w:szCs w:val="22"/>
+        </w:rPr>
+        <w:t>matricula</w:t>
+      </w:r>
+      <w:proofErr w:type="gramEnd"/>
+      <w:r>
+        <w:rPr>
+          <w:sz w:val="22"/>
+          <w:szCs w:val="22"/>
+        </w:rPr>
+        <w:t>};</w:t>
+      </w:r>
+    </w:p>
+    <w:p>
+      <w:pPr>
+        <w:pStyle w:val="NormalWeb"/>
+        <w:jc w:val="both"/>
+        <w:rPr>
+          <w:sz w:val="22"/>
+          <w:szCs w:val="22"/>
+        </w:rPr>
+      </w:pPr>
+      <w:r>
+        <w:rPr>
+          <w:sz w:val="22"/>
+          <w:szCs w:val="22"/>
+        </w:rPr>
+        <w:t>{/</w:t>
+      </w:r>
+      <w:proofErr w:type="spellStart"/>
+      <w:r>
+        <w:rPr>
+          <w:sz w:val="22"/>
+          <w:szCs w:val="22"/>
+        </w:rPr>
+        <w:t>imoveis</w:t>
+      </w:r>
+      <w:proofErr w:type="spellEnd"/>
+      <w:r>
+        <w:rPr>
+          <w:sz w:val="22"/>
+          <w:szCs w:val="22"/>
+        </w:rPr>
+        <w:t>}</w:t>
+      </w:r>
+    </w:p>
+    <w:p>
+      <w:pPr>
+        <w:pStyle w:val="NormalWeb"/>
+        <w:jc w:val="both"/>
+        <w:rPr>
+          <w:sz w:val="22"/>
+          <w:szCs w:val="22"/>
+        </w:rPr>
+      </w:pPr>
+      <w:r>
+        <w:rPr>
+          <w:sz w:val="22"/>
+          <w:szCs w:val="22"/>
+        </w:rPr>
+        <w:t>Não é nem nunca foi contribuinte da Previdência Social na condição de empregador, por não manter nem ter mantido a seu serviço segurado(s) empregado(s) ou trabalhador(es) avulso(s) nesta(s) propriedade(s) rural(</w:t>
+      </w:r>
+      <w:proofErr w:type="spellStart"/>
+      <w:r>
+        <w:rPr>
+          <w:sz w:val="22"/>
+          <w:szCs w:val="22"/>
+        </w:rPr>
+        <w:t>is</w:t>
+      </w:r>
+      <w:proofErr w:type="spellEnd"/>
+      <w:r>
+        <w:rPr>
+          <w:sz w:val="22"/>
+          <w:szCs w:val="22"/>
+        </w:rPr>
+        <w:t>).</w:t>
+      </w:r>
+    </w:p>
+    <w:p>
+      <w:pPr>
+        <w:pStyle w:val="NormalWeb"/>
+        <w:jc w:val="both"/>
+      </w:pPr>
+      <w:r>
+        <w:rPr>
+          <w:sz w:val="22"/>
+          <w:szCs w:val="22"/>
+        </w:rPr>
+        <w:t>Declara, ainda, que, não comercializa a produção por ele obtida no(s) referido(s) imóvel(</w:t>
+      </w:r>
+      <w:proofErr w:type="spellStart"/>
+      <w:r>
+        <w:rPr>
+          <w:sz w:val="22"/>
+          <w:szCs w:val="22"/>
+        </w:rPr>
+        <w:t>is</w:t>
+      </w:r>
+      <w:proofErr w:type="spellEnd"/>
+      <w:r>
+        <w:rPr>
+          <w:sz w:val="22"/>
+          <w:szCs w:val="22"/>
+        </w:rPr>
+        <w:t>) rural(</w:t>
+      </w:r>
+      <w:proofErr w:type="spellStart"/>
+      <w:r>
+        <w:rPr>
+          <w:sz w:val="22"/>
+          <w:szCs w:val="22"/>
+        </w:rPr>
+        <w:t>is</w:t>
+      </w:r>
+      <w:proofErr w:type="spellEnd"/>
+      <w:r>
+        <w:rPr>
+          <w:sz w:val="22"/>
+          <w:szCs w:val="22"/>
+        </w:rPr>
+        <w:t>) com consumidor pessoa física, no varejo; nem com adquirente pessoa física, não produtor rural, para venda no varejo a consumidor pessoa física; nem com outro produtor rural pessoa física; nem com outro segurado especial; nem com empresa adquirente, consumidora, consignatária ou cooperativa; nem comercializou a referida produção, até 12/12/2001, com adquirente domiciliado no exterior (exportação).</w:t>
       </w:r>
     </w:p>
     <w:p>
@@ -1665,7 +1798,7 @@
           <w:szCs w:val="22"/>
         </w:rPr>
         <w:lastRenderedPageBreak/>
-        <w:t>(  )   Conhece e cumpre o que determina a legislação que regulamenta o uso de organismos geneticamente modificados (</w:t>
+        <w:t>({</w:t>
       </w:r>
       <w:proofErr w:type="spellStart"/>
       <w:r>
@@ -1673,7 +1806,7 @@
           <w:sz w:val="22"/>
           <w:szCs w:val="22"/>
         </w:rPr>
-        <w:t>OGM´s</w:t>
+        <w:t>chk_prev_nenhum</w:t>
       </w:r>
       <w:proofErr w:type="spellEnd"/>
       <w:r>
@@ -1681,99 +1814,61 @@
           <w:sz w:val="22"/>
           <w:szCs w:val="22"/>
         </w:rPr>
-        <w:t>), comprometendo-se a somente utilizar sementes, insumos ou produtos originados a partir de cultivares transgênicas registradas e autorizadas para produção comercial no Brasil e que adoto as recomendações técnicas preconizadas pela Empresa Brasileira de Pesquisa Agropecuária (EMBRAPA).</w:t>
-      </w:r>
-    </w:p>
-    <w:p>
-      <w:pPr>
-        <w:pStyle w:val="NormalWeb"/>
-        <w:jc w:val="both"/>
-      </w:pPr>
-      <w:r>
-        <w:rPr>
-          <w:sz w:val="22"/>
-          <w:szCs w:val="22"/>
-        </w:rPr>
-        <w:t>(  )   Com relação ao custeio de algodão:</w:t>
-      </w:r>
-    </w:p>
-    <w:p>
-      <w:pPr>
-        <w:pStyle w:val="NormalWeb"/>
-        <w:jc w:val="both"/>
-      </w:pPr>
-      <w:r>
-        <w:rPr>
-          <w:sz w:val="22"/>
-          <w:szCs w:val="22"/>
-        </w:rPr>
-        <w:t>- São adotadas as práticas agrícolas e os orçamentos-padrão elaborados pela EMBRAPA, constantes no módulo de orçamentos do SEAP;</w:t>
-      </w:r>
-    </w:p>
-    <w:p>
-      <w:pPr>
-        <w:pStyle w:val="NormalWeb"/>
-        <w:jc w:val="both"/>
-      </w:pPr>
-      <w:r>
-        <w:rPr>
-          <w:sz w:val="22"/>
-          <w:szCs w:val="22"/>
-        </w:rPr>
-        <w:t>- Beneficia(m) a produção de algodão em usinas próprias, comercializando os produtos diretamente aos grandes compradores nacionais e internacionais, sem intermediação de empresa de beneficiamento;</w:t>
-      </w:r>
-    </w:p>
-    <w:p>
-      <w:pPr>
-        <w:pStyle w:val="NormalWeb"/>
-        <w:jc w:val="both"/>
-      </w:pPr>
-      <w:r>
-        <w:rPr>
-          <w:sz w:val="22"/>
-          <w:szCs w:val="22"/>
-        </w:rPr>
-        <w:t>- Obriga-se a seguir rigorosamente as recomendações técnicas da EMBRAPA para a cultura, transmitidas pelo responsável pela assistência técnica, com ênfase às práticas de combate ao bicudo;</w:t>
-      </w:r>
-    </w:p>
-    <w:p>
-      <w:pPr>
-        <w:pStyle w:val="NormalWeb"/>
-        <w:jc w:val="both"/>
-      </w:pPr>
-      <w:r>
-        <w:rPr>
-          <w:sz w:val="22"/>
-          <w:szCs w:val="22"/>
-        </w:rPr>
-        <w:t>- Os profissionais responsáveis pela assessoria empresarial e técnica participaram de treinamento específico sobre a cultura do algodão e estão aptos a transmitir as orientações da EMBRAPA a respeito do assunto;</w:t>
-      </w:r>
-    </w:p>
-    <w:p>
-      <w:pPr>
-        <w:pStyle w:val="NormalWeb"/>
-        <w:jc w:val="both"/>
-      </w:pPr>
-      <w:r>
-        <w:rPr>
-          <w:sz w:val="22"/>
-          <w:szCs w:val="22"/>
-        </w:rPr>
-        <w:t>- O pleito refere-se ao cultivo de algodão herbáceo, e foram eliminados totalmente os restos de cultura do algodão da safra anterior, pelos métodos de arranque completo, queima ou destruição e incorporação;</w:t>
-      </w:r>
-    </w:p>
-    <w:p>
-      <w:pPr>
-        <w:pStyle w:val="NormalWeb"/>
-        <w:jc w:val="both"/>
-      </w:pPr>
-      <w:r>
-        <w:rPr>
-          <w:sz w:val="22"/>
-          <w:szCs w:val="22"/>
-        </w:rPr>
-        <w:t>- Não realizará queimadas e nem desmatamentos nos imóveis objetos do presente financiamento.</w:t>
-      </w:r>
+        <w:t>})</w:t>
+      </w:r>
+      <w:r>
+        <w:rPr>
+          <w:sz w:val="22"/>
+          <w:szCs w:val="22"/>
+        </w:rPr>
+        <w:t>   Não se constitui em empresário registrado na Junta Comercial, na forma do Código Civil, bem como que não é, nem nunca foi, contribuinte da Previdência Social como empregador e que não mantém nem manteve a seu serviço segurados empregados ou trabalhadores avulsos, (e que não comercializa a própria produção, "se produtor rural ou segurado especial", na forma prevista no inciso I do art. 166 da Instrução Normativa RFB nº 971 de 13/11/2009 e respectivas alterações), não estando, portanto, sujeito(a) ao cumprimento da exigência de apresentação de Certidão Negativa de Débito - CND, a que alude o art. 10 da Lei nº 8.870, de 15/04/94, para fins de obtenção de crédito junto ao Banco do Nordeste.</w:t>
+      </w:r>
+    </w:p>
+    <w:p>
+      <w:pPr>
+        <w:pStyle w:val="NormalWeb"/>
+        <w:jc w:val="both"/>
+        <w:rPr>
+          <w:sz w:val="22"/>
+          <w:szCs w:val="22"/>
+        </w:rPr>
+      </w:pPr>
+      <w:r>
+        <w:rPr>
+          <w:sz w:val="22"/>
+          <w:szCs w:val="22"/>
+        </w:rPr>
+        <w:t>({</w:t>
+      </w:r>
+      <w:proofErr w:type="spellStart"/>
+      <w:r>
+        <w:rPr>
+          <w:sz w:val="22"/>
+          <w:szCs w:val="22"/>
+        </w:rPr>
+        <w:t>chk_prev_emp</w:t>
+      </w:r>
+      <w:proofErr w:type="spellEnd"/>
+      <w:r>
+        <w:rPr>
+          <w:sz w:val="22"/>
+          <w:szCs w:val="22"/>
+        </w:rPr>
+        <w:t>})</w:t>
+      </w:r>
+      <w:r>
+        <w:rPr>
+          <w:sz w:val="22"/>
+          <w:szCs w:val="22"/>
+        </w:rPr>
+        <w:t>   Constitui-se em empresário registrado na Junta Comercial, na forma do Código Civil, e não é, nem nunca foi, contribuinte da Previdência Social como empregador e que não mantém nem manteve a seu serviço segurados empregados ou trabalhadores avulsos, (e que não comercializa a própria produção, "se produtor rural ou segurado especial", na forma prevista no inciso I do art. 166 da Instrução Normativa RFB nº 971 de 13/11/2009 e respectivas alterações), não estando, portanto, sujeito(a) ao cumprimento da exigência de apresentação de Certidão Negativa de Débito - CND, a que alude o art. 10 da Lei nº 8.870, de 15/04/94, para fins de obtenção de crédito junto ao Banco do Nordeste.</w:t>
+      </w:r>
+    </w:p>
+    <w:p>
+      <w:pPr>
+        <w:pStyle w:val="NormalWeb"/>
+        <w:jc w:val="both"/>
+      </w:pPr>
     </w:p>
     <w:p>
       <w:pPr>
@@ -1787,6 +1882,186 @@
           <w:sz w:val="22"/>
           <w:szCs w:val="22"/>
         </w:rPr>
+        <w:t>Declaração Referente ao Financiamento de Soja, Milho e Algodão</w:t>
+      </w:r>
+    </w:p>
+    <w:p>
+      <w:pPr>
+        <w:pStyle w:val="NormalWeb"/>
+        <w:jc w:val="both"/>
+      </w:pPr>
+      <w:proofErr w:type="gramStart"/>
+      <w:r>
+        <w:rPr>
+          <w:sz w:val="22"/>
+          <w:szCs w:val="22"/>
+        </w:rPr>
+        <w:t>(  )</w:t>
+      </w:r>
+      <w:proofErr w:type="gramEnd"/>
+      <w:r>
+        <w:rPr>
+          <w:sz w:val="22"/>
+          <w:szCs w:val="22"/>
+        </w:rPr>
+        <w:t>   Conhece e cumpre o que determina a legislação que regulamenta o uso de organismos geneticamente modificados (</w:t>
+      </w:r>
+      <w:proofErr w:type="spellStart"/>
+      <w:r>
+        <w:rPr>
+          <w:sz w:val="22"/>
+          <w:szCs w:val="22"/>
+        </w:rPr>
+        <w:t>OGM´s</w:t>
+      </w:r>
+      <w:proofErr w:type="spellEnd"/>
+      <w:r>
+        <w:rPr>
+          <w:sz w:val="22"/>
+          <w:szCs w:val="22"/>
+        </w:rPr>
+        <w:t>), comprometendo-se a somente utilizar sementes, insumos ou produtos originados a partir de cultivares transgênicas registradas e autorizadas para produção comercial no Brasil e que adoto as recomendações técnicas preconizadas pela Empresa Brasileira de Pesquisa Agropecuária (EMBRAPA).</w:t>
+      </w:r>
+    </w:p>
+    <w:p>
+      <w:pPr>
+        <w:pStyle w:val="NormalWeb"/>
+        <w:jc w:val="both"/>
+      </w:pPr>
+      <w:proofErr w:type="gramStart"/>
+      <w:r>
+        <w:rPr>
+          <w:sz w:val="22"/>
+          <w:szCs w:val="22"/>
+        </w:rPr>
+        <w:t>(  )</w:t>
+      </w:r>
+      <w:proofErr w:type="gramEnd"/>
+      <w:r>
+        <w:rPr>
+          <w:sz w:val="22"/>
+          <w:szCs w:val="22"/>
+        </w:rPr>
+        <w:t>   Com relação ao custeio de algodão:</w:t>
+      </w:r>
+    </w:p>
+    <w:p>
+      <w:pPr>
+        <w:pStyle w:val="NormalWeb"/>
+        <w:jc w:val="both"/>
+      </w:pPr>
+      <w:r>
+        <w:rPr>
+          <w:sz w:val="22"/>
+          <w:szCs w:val="22"/>
+        </w:rPr>
+        <w:t xml:space="preserve">- São </w:t>
+      </w:r>
+      <w:proofErr w:type="gramStart"/>
+      <w:r>
+        <w:rPr>
+          <w:sz w:val="22"/>
+          <w:szCs w:val="22"/>
+        </w:rPr>
+        <w:t>adotadas</w:t>
+      </w:r>
+      <w:proofErr w:type="gramEnd"/>
+      <w:r>
+        <w:rPr>
+          <w:sz w:val="22"/>
+          <w:szCs w:val="22"/>
+        </w:rPr>
+        <w:t xml:space="preserve"> as práticas agrícolas e os orçamentos-padrão elaborados pela EMBRAPA, constantes no módulo de orçamentos do SEAP;</w:t>
+      </w:r>
+    </w:p>
+    <w:p>
+      <w:pPr>
+        <w:pStyle w:val="NormalWeb"/>
+        <w:jc w:val="both"/>
+      </w:pPr>
+      <w:r>
+        <w:rPr>
+          <w:sz w:val="22"/>
+          <w:szCs w:val="22"/>
+        </w:rPr>
+        <w:t>- Beneficia(m) a produção de algodão em usinas próprias, comercializando os produtos diretamente aos grandes compradores nacionais e internacionais, sem intermediação de empresa de beneficiamento;</w:t>
+      </w:r>
+    </w:p>
+    <w:p>
+      <w:pPr>
+        <w:pStyle w:val="NormalWeb"/>
+        <w:jc w:val="both"/>
+      </w:pPr>
+      <w:r>
+        <w:rPr>
+          <w:sz w:val="22"/>
+          <w:szCs w:val="22"/>
+        </w:rPr>
+        <w:t>- Obriga-se a seguir rigorosamente as recomendações técnicas da EMBRAPA para a cultura, transmitidas pelo responsável pela assistência técnica, com ênfase às práticas de combate ao bicudo;</w:t>
+      </w:r>
+    </w:p>
+    <w:p>
+      <w:pPr>
+        <w:pStyle w:val="NormalWeb"/>
+        <w:jc w:val="both"/>
+      </w:pPr>
+      <w:r>
+        <w:rPr>
+          <w:sz w:val="22"/>
+          <w:szCs w:val="22"/>
+        </w:rPr>
+        <w:t>- Os profissionais responsáveis pela assessoria empresarial e técnica participaram de treinamento específico sobre a cultura do algodão e estão aptos a transmitir as orientações da EMBRAPA a respeito do assunto;</w:t>
+      </w:r>
+    </w:p>
+    <w:p>
+      <w:pPr>
+        <w:pStyle w:val="NormalWeb"/>
+        <w:jc w:val="both"/>
+      </w:pPr>
+      <w:r>
+        <w:rPr>
+          <w:sz w:val="22"/>
+          <w:szCs w:val="22"/>
+        </w:rPr>
+        <w:t>- O pleito refere-se ao cultivo de algodão herbáceo, e foram eliminados totalmente os restos de cultura do algodão da safra anterior, pelos métodos de arranque completo, queima ou destruição e incorporação;</w:t>
+      </w:r>
+    </w:p>
+    <w:p>
+      <w:pPr>
+        <w:pStyle w:val="NormalWeb"/>
+        <w:jc w:val="both"/>
+        <w:rPr>
+          <w:sz w:val="22"/>
+          <w:szCs w:val="22"/>
+        </w:rPr>
+      </w:pPr>
+      <w:r>
+        <w:rPr>
+          <w:sz w:val="22"/>
+          <w:szCs w:val="22"/>
+        </w:rPr>
+        <w:t>- Não realizará queimadas e nem desmatamentos nos imóveis objetos do presente financiamento.</w:t>
+      </w:r>
+    </w:p>
+    <w:p>
+      <w:pPr>
+        <w:pStyle w:val="NormalWeb"/>
+        <w:jc w:val="both"/>
+      </w:pPr>
+    </w:p>
+    <w:p>
+      <w:pPr>
+        <w:pStyle w:val="NormalWeb"/>
+        <w:jc w:val="center"/>
+      </w:pPr>
+      <w:r>
+        <w:rPr>
+          <w:b/>
+          <w:bCs/>
+          <w:sz w:val="22"/>
+          <w:szCs w:val="22"/>
+        </w:rPr>
+        <w:lastRenderedPageBreak/>
         <w:t>Declaração de Suporte Forrageiro</w:t>
       </w:r>
     </w:p>
@@ -1811,6 +2086,7 @@
         <w:t>chk_forr_sim</w:t>
       </w:r>
       <w:proofErr w:type="spellEnd"/>
+      <w:proofErr w:type="gramStart"/>
       <w:r>
         <w:rPr>
           <w:sz w:val="22"/>
@@ -1823,7 +2099,15 @@
           <w:sz w:val="22"/>
           <w:szCs w:val="22"/>
         </w:rPr>
-        <w:t>   Na(s) seguinte(s) propriedade(s), dispõe de suporte forrageiro e recursos hídricos necessários para apascentar os animais existentes e os que estão sendo adquiridos:</w:t>
+        <w:t xml:space="preserve">   </w:t>
+      </w:r>
+      <w:proofErr w:type="gramEnd"/>
+      <w:r>
+        <w:rPr>
+          <w:sz w:val="22"/>
+          <w:szCs w:val="22"/>
+        </w:rPr>
+        <w:t>Na(s) seguinte(s) propriedade(s), dispõe de suporte forrageiro e recursos hídricos necessários para apascentar os animais existentes e os que estão sendo adquiridos:</w:t>
       </w:r>
     </w:p>
     <w:tbl>
@@ -1955,7 +2239,21 @@
               <w:rPr>
                 <w:rFonts w:ascii="Times New Roman" w:hAnsi="Times New Roman" w:cs="Times New Roman"/>
               </w:rPr>
-              <w:t>{#imoveis}{nome}</w:t>
+              <w:t>{#</w:t>
+            </w:r>
+            <w:proofErr w:type="gramStart"/>
+            <w:r>
+              <w:rPr>
+                <w:rFonts w:ascii="Times New Roman" w:hAnsi="Times New Roman" w:cs="Times New Roman"/>
+              </w:rPr>
+              <w:t>imoveis}{</w:t>
+            </w:r>
+            <w:proofErr w:type="gramEnd"/>
+            <w:r>
+              <w:rPr>
+                <w:rFonts w:ascii="Times New Roman" w:hAnsi="Times New Roman" w:cs="Times New Roman"/>
+              </w:rPr>
+              <w:t>nome}</w:t>
             </w:r>
           </w:p>
         </w:tc>
@@ -2037,6 +2335,7 @@
         </w:tc>
       </w:tr>
     </w:tbl>
+    <w:p/>
     <w:p>
       <w:pPr>
         <w:rPr>
@@ -2068,6 +2367,7 @@
           <w:szCs w:val="22"/>
         </w:rPr>
       </w:pPr>
+      <w:proofErr w:type="gramStart"/>
       <w:r>
         <w:rPr>
           <w:sz w:val="22"/>
@@ -2082,6 +2382,7 @@
         </w:rPr>
         <w:t>x</w:t>
       </w:r>
+      <w:proofErr w:type="gramEnd"/>
       <w:r>
         <w:rPr>
           <w:sz w:val="22"/>
@@ -2997,6 +3298,7 @@
   <w:style w:type="character" w:default="1" w:styleId="Fontepargpadro">
     <w:name w:val="Default Paragraph Font"/>
     <w:uiPriority w:val="1"/>
+    <w:semiHidden/>
     <w:unhideWhenUsed/>
   </w:style>
   <w:style w:type="table" w:default="1" w:styleId="Tabelanormal">

</xml_diff>

<commit_message>
ATUALIZANDO C/ COPIAR E COLAR OK / ENVIO TEAMS
</commit_message>
<xml_diff>
--- a/public/moldes-word/consolidada-rural-pronaf.docx
+++ b/public/moldes-word/consolidada-rural-pronaf.docx
@@ -133,16 +133,6 @@
     <w:p>
       <w:pPr>
         <w:pStyle w:val="NormalWeb"/>
-        <w:jc w:val="both"/>
-        <w:rPr>
-          <w:sz w:val="22"/>
-          <w:szCs w:val="22"/>
-        </w:rPr>
-      </w:pPr>
-    </w:p>
-    <w:p>
-      <w:pPr>
-        <w:pStyle w:val="NormalWeb"/>
         <w:jc w:val="center"/>
       </w:pPr>
       <w:r>
@@ -159,10 +149,6 @@
       <w:pPr>
         <w:pStyle w:val="NormalWeb"/>
         <w:jc w:val="both"/>
-        <w:rPr>
-          <w:sz w:val="22"/>
-          <w:szCs w:val="22"/>
-        </w:rPr>
       </w:pPr>
       <w:r>
         <w:rPr>
@@ -183,7 +169,14 @@
           <w:sz w:val="22"/>
           <w:szCs w:val="22"/>
         </w:rPr>
-        <w:t xml:space="preserve"> )   Autoriza o Banco do Nordeste do Brasil S.A. a debitar em sua conta de depósito de livre movimentação de número</w:t>
+        <w:t xml:space="preserve"> )   </w:t>
+      </w:r>
+      <w:r>
+        <w:rPr>
+          <w:sz w:val="22"/>
+          <w:szCs w:val="22"/>
+        </w:rPr>
+        <w:t>Autoriza o Banco do Nordeste do Brasil S.A. a debitar em sua conta de depósito de livre movimentação de número</w:t>
       </w:r>
       <w:r>
         <w:rPr>
@@ -199,13 +192,15 @@
         </w:rPr>
         <w:t>{</w:t>
       </w:r>
-      <w:r>
-        <w:rPr>
-          <w:sz w:val="22"/>
-          <w:szCs w:val="22"/>
-        </w:rPr>
-        <w:t xml:space="preserve">  </w:t>
-      </w:r>
+      <w:proofErr w:type="spellStart"/>
+      <w:r>
+        <w:rPr>
+          <w:sz w:val="22"/>
+          <w:szCs w:val="22"/>
+        </w:rPr>
+        <w:t>conta_corrente</w:t>
+      </w:r>
+      <w:proofErr w:type="spellEnd"/>
       <w:r>
         <w:rPr>
           <w:sz w:val="22"/>
@@ -232,14 +227,15 @@
           <w:sz w:val="22"/>
           <w:szCs w:val="22"/>
         </w:rPr>
-        <w:t>, a seu critério, as despesas inerentes ao estudo de proposta, avaliação patrimonial, IOF, tarifas, ressarcimento, quando permitido, de despesas de fiscalização ou medições de lavoura etc. referentes à contratação de suas operações de crédito, bem como registros cartorários, honorários advocatícios, prêmios de seguros de bens oferecidos em garantia, além da amortização de parcelas de principal e de encargos, incluindo multa e mora de todas as suas operações contratadas com essa Instituição Financeira.</w:t>
-      </w:r>
-    </w:p>
-    <w:p>
-      <w:pPr>
-        <w:pStyle w:val="NormalWeb"/>
-        <w:jc w:val="both"/>
-      </w:pPr>
+        <w:t xml:space="preserve">, </w:t>
+      </w:r>
+      <w:r>
+        <w:rPr>
+          <w:sz w:val="22"/>
+          <w:szCs w:val="22"/>
+        </w:rPr>
+        <w:t>a seu critério, as despesas inerentes à avaliação patrimonial, IOF, ressarcimento, quando permitido, de despesas de fiscalização ou medições de lavoura etc. referentes à contratação de suas operações de crédito, bem como registros cartorários, honorários advocatícios, prêmios de seguros de bens oferecidos em garantia, além da amortização de parcelas de principal e de encargos, incluindo multa e mora de todas as suas operações contratadas com essa Instituição Financeira.</w:t>
+      </w:r>
     </w:p>
     <w:p>
       <w:pPr>
@@ -280,15 +276,21 @@
           <w:sz w:val="22"/>
           <w:szCs w:val="22"/>
         </w:rPr>
-        <w:t xml:space="preserve"> )   Autoriza o Banco do Nordeste do Brasil S.A. a consultar, no sítio do Banco Central do Brasil, na internet, nos moldes da legislação em vigor, sobre todos os dados ali constantes a seu respeito, relativamente a financiamentos, empréstimos, descontos, adiantamentos e quaisquer outras modalidades de operação de crédito de sua responsabilidade perante quaisquer instituições financeiras e outras instituições autorizadas a funcionar pelo Banco Central do Brasil, bem como registrar os débitos e responsabilidades decorrentes de operações com características de crédito, que constem ou venham a constar em nome do cliente, no SCR ou nos sistemas que venham a complementar ou a substituir o SCR. O cliente, ainda, concorda em estender a presente autorização de consulta ao SCR às demais instituições autorizadas a consultá-lo e que adquiram ou recebam em garantia, ou manifestem interesse de adquirir ou de receber em garantia, total ou parcialmente, operações de crédito sob sua responsabilidade.</w:t>
-      </w:r>
-    </w:p>
-    <w:p>
-      <w:pPr>
-        <w:pStyle w:val="NormalWeb"/>
-        <w:jc w:val="both"/>
-      </w:pPr>
-      <w:proofErr w:type="gramStart"/>
+        <w:t xml:space="preserve"> )   </w:t>
+      </w:r>
+      <w:r>
+        <w:rPr>
+          <w:sz w:val="22"/>
+          <w:szCs w:val="22"/>
+        </w:rPr>
+        <w:t>Autoriza o Banco do Nordeste do Brasil S.A. a consultar, no sítio do Banco Central do Brasil, na internet, nos moldes da legislação em vigor, sobre todos os dados ali constantes a seu respeito, relativamente a financiamentos, empréstimos, descontos, adiantamentos e quaisquer outras modalidades de operação de crédito de sua responsabilidade perante quaisquer instituições financeiras e outras instituições autorizadas a funcionar pelo Banco Central do Brasil, bem como registrar os débitos e responsabilidades decorrentes de operações com características de crédito, que constem ou venham a constar em nome do cliente, no SCR ou nos sistemas que venham a complementar ou a substituir o SCR. O cliente, ainda, concorda em estender a presente autorização de consulta ao SCR às demais instituições autorizadas a consultá-lo e que adquiram ou recebam em garantia, ou manifestem interesse de adquirir ou de receber em garantia, total ou parcialmente, operações de crédito sob sua responsabilidade.</w:t>
+      </w:r>
+    </w:p>
+    <w:p>
+      <w:pPr>
+        <w:pStyle w:val="NormalWeb"/>
+        <w:jc w:val="both"/>
+      </w:pPr>
       <w:r>
         <w:rPr>
           <w:sz w:val="22"/>
@@ -303,7 +305,6 @@
         </w:rPr>
         <w:t>x</w:t>
       </w:r>
-      <w:proofErr w:type="gramEnd"/>
       <w:r>
         <w:rPr>
           <w:sz w:val="22"/>
@@ -322,23 +323,14 @@
           <w:sz w:val="22"/>
           <w:szCs w:val="22"/>
         </w:rPr>
-        <w:t xml:space="preserve">a)  Todos e quaisquer débitos e responsabilidades decorrentes de quaisquer operações com características de crédito realizadas pelo cliente junto a este banco, demais instituições financeiras ou empresas a ele ligadas e/ou por ele controladas, bem como seus sucessores, serão registrados no Sistema de Informações de Créditos (SCR) administrado pelo Banco Central do Brasil (BACEN) </w:t>
-      </w:r>
-      <w:proofErr w:type="gramStart"/>
-      <w:r>
-        <w:rPr>
-          <w:sz w:val="22"/>
-          <w:szCs w:val="22"/>
-        </w:rPr>
-        <w:t>e também</w:t>
-      </w:r>
-      <w:proofErr w:type="gramEnd"/>
-      <w:r>
-        <w:rPr>
-          <w:sz w:val="22"/>
-          <w:szCs w:val="22"/>
-        </w:rPr>
-        <w:t xml:space="preserve"> nos eventuais sistemas que venham a substituir ou a complementar o SCR;</w:t>
+        <w:t xml:space="preserve">a)  </w:t>
+      </w:r>
+      <w:r>
+        <w:rPr>
+          <w:sz w:val="22"/>
+          <w:szCs w:val="22"/>
+        </w:rPr>
+        <w:t>Todos e quaisquer débitos e responsabilidades decorrentes de quaisquer operações com características de crédito realizadas pelo cliente junto a este banco, demais instituições financeiras ou empresas a ele ligadas e/ou por ele controladas, bem como seus sucessores, serão registrados no Sistema de Informações de Créditos (SCR) administrado pelo Banco Central do Brasil (BACEN) e também nos eventuais sistemas que venham a substituir ou a complementar o SCR;</w:t>
       </w:r>
     </w:p>
     <w:p>
@@ -390,21 +382,28 @@
           <w:sz w:val="22"/>
           <w:szCs w:val="22"/>
         </w:rPr>
+        <w:t>c)  O cliente poderá ter acesso aos dados constantes em seu nome no SCR, por meio do Registrato - Extrato do Registro de Informações no BACEN ou da Central de Atendimento ao Público do BACEN;</w:t>
+      </w:r>
+    </w:p>
+    <w:p>
+      <w:pPr>
+        <w:pStyle w:val="NormalWeb"/>
+        <w:jc w:val="both"/>
+      </w:pPr>
+      <w:r>
+        <w:rPr>
+          <w:sz w:val="22"/>
+          <w:szCs w:val="22"/>
+        </w:rPr>
+        <w:t xml:space="preserve">d)  As manifestações de discordância quanto às informações constantes do SCR e os pedidos de correções, exclusões e registros de medidas judiciais no SCR deverão ser dirigidos a este banco, </w:t>
+      </w:r>
+      <w:r>
+        <w:rPr>
+          <w:sz w:val="22"/>
+          <w:szCs w:val="22"/>
+        </w:rPr>
         <w:lastRenderedPageBreak/>
-        <w:t>c)  O cliente poderá ter acesso aos dados constantes em seu nome no SCR, por meio do Registrato - Extrato do Registro de Informações no BACEN ou da Central de Atendimento ao Público do BACEN;</w:t>
-      </w:r>
-    </w:p>
-    <w:p>
-      <w:pPr>
-        <w:pStyle w:val="NormalWeb"/>
-        <w:jc w:val="both"/>
-      </w:pPr>
-      <w:r>
-        <w:rPr>
-          <w:sz w:val="22"/>
-          <w:szCs w:val="22"/>
-        </w:rPr>
-        <w:t>d)  As manifestações de discordância quanto às informações constantes do SCR e os pedidos de correções, exclusões e registros de medidas judiciais no SCR deverão ser dirigidos a este banco, por meio de requerimento escrito e fundamentado do cliente, acompanhado da respectiva decisão judicial, quando for o caso;</w:t>
+        <w:t>por meio de requerimento escrito e fundamentado do cliente, acompanhado da respectiva decisão judicial, quando for o caso;</w:t>
       </w:r>
     </w:p>
     <w:p>
@@ -427,87 +426,130 @@
     <w:p>
       <w:pPr>
         <w:pStyle w:val="NormalWeb"/>
-        <w:jc w:val="both"/>
-        <w:rPr>
-          <w:sz w:val="22"/>
-          <w:szCs w:val="22"/>
-        </w:rPr>
-      </w:pPr>
-    </w:p>
-    <w:p>
-      <w:pPr>
-        <w:pStyle w:val="NormalWeb"/>
+        <w:widowControl w:val="0"/>
+        <w:suppressAutoHyphens/>
         <w:jc w:val="center"/>
         <w:rPr>
+          <w:rFonts w:eastAsia="Arial"/>
           <w:b/>
           <w:bCs/>
-        </w:rPr>
-      </w:pPr>
-      <w:r>
-        <w:rPr>
+          <w:sz w:val="22"/>
+          <w:szCs w:val="22"/>
+        </w:rPr>
+      </w:pPr>
+      <w:r>
+        <w:rPr>
+          <w:rFonts w:eastAsia="Arial"/>
           <w:b/>
           <w:bCs/>
+          <w:sz w:val="22"/>
+          <w:szCs w:val="22"/>
         </w:rPr>
         <w:t>Autorização de Consulta ao SICOR</w:t>
       </w:r>
     </w:p>
     <w:p>
       <w:pPr>
-        <w:pStyle w:val="NormalWeb"/>
-        <w:jc w:val="both"/>
-      </w:pPr>
-      <w:r>
-        <w:rPr>
-          <w:sz w:val="22"/>
-          <w:szCs w:val="22"/>
-        </w:rPr>
-        <w:t>( x ) </w:t>
-      </w:r>
-      <w:r>
-        <w:t xml:space="preserve"> Autoriza o Banco do Nordeste do Brasil S.A. a acessar diretamente todas as informações relativas à presente operação de crédito rural, inclusive o histórico de alterações, registrada pelo BANCO no Sistema de Operações do Crédito Rural e do Proagro - SICOR, gerido pelo Banco Central do Brasil – BACEN, ou outro sistema que venha substituí-lo, até 5 (cinco) anos após o prazo final de amortização previsto no respectivo instrumento contratual para a liquidação normal das obrigações financeiras, para as seguintes finalidades:</w:t>
-      </w:r>
-    </w:p>
-    <w:p>
-      <w:pPr>
-        <w:pStyle w:val="NormalWeb"/>
-        <w:jc w:val="both"/>
-      </w:pPr>
-      <w:r>
-        <w:t>I - Fiscalizar o cumprimento das condições estabelecidas para a contratação e manutenção do crédito;</w:t>
-      </w:r>
-    </w:p>
-    <w:p>
-      <w:pPr>
-        <w:pStyle w:val="NormalWeb"/>
-        <w:jc w:val="both"/>
-      </w:pPr>
-      <w:r>
-        <w:t>II - Obter informações com o propósito de: oferecer aos beneficiários de crédito rural serviços e produtos adequados às necessidades de suas atividades produtivas rurais; ampliar o volume de recursos disponíveis aos beneficiários de crédito rural, inclusive por meio de fontes de financiamento alternativas ao crédito rural; e identificar a extensão, em termos de promoção do desenvolvimento nas dimensões econômica, social, ambiental e/ou institucional, em que os objetivos do apoio foram alcançados;</w:t>
-      </w:r>
-    </w:p>
-    <w:p>
-      <w:pPr>
-        <w:pStyle w:val="NormalWeb"/>
-        <w:jc w:val="both"/>
-      </w:pPr>
-      <w:r>
-        <w:t>III - Permitir o uso de dados necessários em processos de certificação, validação ou de natureza semelhante, em que o beneficiário de crédito rural seja parte envolvida;</w:t>
-      </w:r>
-    </w:p>
-    <w:p>
-      <w:pPr>
-        <w:pStyle w:val="NormalWeb"/>
-        <w:jc w:val="both"/>
-      </w:pPr>
-      <w:r>
-        <w:t>IV - Examinar o nível de alavancagem e o grau de endividamento do beneficiário de crédito rural em operações de crédito rural.</w:t>
-      </w:r>
-    </w:p>
-    <w:p>
-      <w:pPr>
-        <w:pStyle w:val="NormalWeb"/>
-        <w:jc w:val="both"/>
-      </w:pPr>
+        <w:widowControl w:val="0"/>
+        <w:suppressAutoHyphens/>
+        <w:autoSpaceDE w:val="0"/>
+        <w:autoSpaceDN w:val="0"/>
+        <w:adjustRightInd w:val="0"/>
+        <w:spacing w:before="100" w:beforeAutospacing="1" w:after="100" w:afterAutospacing="1"/>
+        <w:jc w:val="both"/>
+        <w:rPr>
+          <w:rFonts w:ascii="Times New Roman" w:hAnsi="Times New Roman" w:cs="Times New Roman"/>
+        </w:rPr>
+      </w:pPr>
+      <w:r>
+        <w:rPr>
+          <w:rFonts w:ascii="Times New Roman" w:hAnsi="Times New Roman" w:cs="Times New Roman"/>
+          <w:color w:val="000000"/>
+        </w:rPr>
+        <w:t>( x )</w:t>
+      </w:r>
+      <w:r>
+        <w:rPr>
+          <w:rFonts w:ascii="Times New Roman" w:hAnsi="Times New Roman" w:cs="Times New Roman"/>
+          <w:color w:val="000000"/>
+        </w:rPr>
+        <w:t xml:space="preserve"> Autoriza o Banco do Nordeste do Brasil S.A. a acessar diretamente todas as informações relativas à presente operação de crédito rural, inclusive o histórico de alterações, registrada pelo BANCO no Sistema de Operações do Crédito Rural e do Proagro - SICOR, gerido pelo Banco Central do Brasil - BACEN, ou outro sistema que venha substituí-lo, até 5 (cinco) anos após o prazo final de amortização previsto no respectivo instrumento contratual para a liquidação normal das obrigações financeiras, para as seguintes finalidades:</w:t>
+      </w:r>
+    </w:p>
+    <w:p>
+      <w:pPr>
+        <w:widowControl w:val="0"/>
+        <w:suppressAutoHyphens/>
+        <w:autoSpaceDE w:val="0"/>
+        <w:autoSpaceDN w:val="0"/>
+        <w:adjustRightInd w:val="0"/>
+        <w:spacing w:before="100" w:beforeAutospacing="1" w:after="100" w:afterAutospacing="1"/>
+        <w:jc w:val="both"/>
+        <w:rPr>
+          <w:rFonts w:ascii="Times New Roman" w:hAnsi="Times New Roman" w:cs="Times New Roman"/>
+        </w:rPr>
+      </w:pPr>
+      <w:r>
+        <w:rPr>
+          <w:rFonts w:ascii="Times New Roman" w:hAnsi="Times New Roman" w:cs="Times New Roman"/>
+          <w:color w:val="000000"/>
+        </w:rPr>
+        <w:t>I - fiscalizar o cumprimento das condições estabelecidas para a contratação e manutenção do crédito;</w:t>
+      </w:r>
+    </w:p>
+    <w:p>
+      <w:pPr>
+        <w:widowControl w:val="0"/>
+        <w:suppressAutoHyphens/>
+        <w:autoSpaceDE w:val="0"/>
+        <w:autoSpaceDN w:val="0"/>
+        <w:adjustRightInd w:val="0"/>
+        <w:spacing w:before="100" w:beforeAutospacing="1" w:after="100" w:afterAutospacing="1"/>
+        <w:jc w:val="both"/>
+        <w:rPr>
+          <w:rFonts w:ascii="Times New Roman" w:hAnsi="Times New Roman" w:cs="Times New Roman"/>
+        </w:rPr>
+      </w:pPr>
+      <w:r>
+        <w:rPr>
+          <w:rFonts w:ascii="Times New Roman" w:hAnsi="Times New Roman" w:cs="Times New Roman"/>
+          <w:color w:val="000000"/>
+        </w:rPr>
+        <w:t>II - obter informações com o propósito de: oferecer aos beneficiários de crédito rural serviços e produtos adequados às necessidades de suas atividades produtivas rurais; ampliar o volume de recursos disponíveis aos beneficiários de crédito rural, inclusive por meio de fontes de financiamento alternativas ao crédito rural; e identificar a extensão, em termos de promoção do desenvolvimento nas dimensões econômica, social, ambiental e/ou institucional, em que os objetivos do apoio foram alcançados;</w:t>
+      </w:r>
+    </w:p>
+    <w:p>
+      <w:pPr>
+        <w:widowControl w:val="0"/>
+        <w:suppressAutoHyphens/>
+        <w:autoSpaceDE w:val="0"/>
+        <w:autoSpaceDN w:val="0"/>
+        <w:adjustRightInd w:val="0"/>
+        <w:spacing w:before="100" w:beforeAutospacing="1" w:after="100" w:afterAutospacing="1"/>
+        <w:jc w:val="both"/>
+        <w:rPr>
+          <w:rFonts w:ascii="Times New Roman" w:hAnsi="Times New Roman" w:cs="Times New Roman"/>
+        </w:rPr>
+      </w:pPr>
+      <w:r>
+        <w:rPr>
+          <w:rFonts w:ascii="Times New Roman" w:hAnsi="Times New Roman" w:cs="Times New Roman"/>
+          <w:color w:val="000000"/>
+        </w:rPr>
+        <w:t>III - permitir o uso de dados necessários em processos de certificação, validação ou de natureza semelhante, em que o beneficiário de crédito rural seja parte envolvida;</w:t>
+      </w:r>
+    </w:p>
+    <w:p>
+      <w:pPr>
+        <w:pStyle w:val="NormalWeb"/>
+        <w:jc w:val="both"/>
+      </w:pPr>
+      <w:r>
+        <w:rPr>
+          <w:color w:val="000000"/>
+        </w:rPr>
+        <w:t>IV - examinar o nível de alavancagem e o grau de endividamento do beneficiário de crédito rural em operações de crédito rural.</w:t>
+      </w:r>
     </w:p>
     <w:p>
       <w:pPr>
@@ -529,7 +571,6 @@
         <w:pStyle w:val="NormalWeb"/>
         <w:jc w:val="both"/>
       </w:pPr>
-      <w:proofErr w:type="gramStart"/>
       <w:r>
         <w:rPr>
           <w:sz w:val="22"/>
@@ -542,47 +583,35 @@
           <w:sz w:val="22"/>
           <w:szCs w:val="22"/>
         </w:rPr>
-        <w:t>x</w:t>
-      </w:r>
-      <w:proofErr w:type="gramEnd"/>
-      <w:r>
-        <w:rPr>
-          <w:sz w:val="22"/>
-          <w:szCs w:val="22"/>
-        </w:rPr>
-        <w:t xml:space="preserve"> </w:t>
-      </w:r>
-      <w:r>
-        <w:rPr>
-          <w:sz w:val="22"/>
-          <w:szCs w:val="22"/>
-        </w:rPr>
-        <w:t>)   Não existe contra si decisão administrativa final, exarada por autoridade ou órgão competente, em razão da prática de atos que importem em exploração de trabalho infantil ou trabalho análogo à escravidão, crime contra o meio ambiente, assédio moral ou sexual, violência contra a mulher, idoso, pessoa com deficiência ou crime resultante de discriminação racial e de etnia.</w:t>
-      </w:r>
-    </w:p>
-    <w:p>
-      <w:pPr>
-        <w:pStyle w:val="NormalWeb"/>
-        <w:jc w:val="both"/>
-        <w:rPr>
-          <w:sz w:val="22"/>
-          <w:szCs w:val="22"/>
-        </w:rPr>
-      </w:pPr>
-      <w:r>
-        <w:rPr>
-          <w:sz w:val="22"/>
-          <w:szCs w:val="22"/>
-        </w:rPr>
-        <w:lastRenderedPageBreak/>
+        <w:t xml:space="preserve">x </w:t>
+      </w:r>
+      <w:r>
+        <w:rPr>
+          <w:sz w:val="22"/>
+          <w:szCs w:val="22"/>
+        </w:rPr>
+        <w:t xml:space="preserve">)   </w:t>
+      </w:r>
+      <w:r>
+        <w:rPr>
+          <w:sz w:val="22"/>
+          <w:szCs w:val="22"/>
+        </w:rPr>
+        <w:t>Não existe contra si decisão administrativa final, exarada por autoridade ou órgão competente, em razão da prática de atos que importem em exploração de trabalho infantil ou trabalho análogo à escravidão, crime contra o meio ambiente, assédio moral ou sexual, violência contra a mulher, idoso, pessoa com deficiência ou crime resultante de discriminação racial e de etnia.</w:t>
+      </w:r>
+    </w:p>
+    <w:p>
+      <w:pPr>
+        <w:pStyle w:val="NormalWeb"/>
+        <w:jc w:val="both"/>
+      </w:pPr>
+      <w:r>
+        <w:rPr>
+          <w:sz w:val="22"/>
+          <w:szCs w:val="22"/>
+        </w:rPr>
         <w:t>E que está ciente de que a falsidade da declaração ora prestada acarretará o vencimento antecipado dos instrumentos contratuais, nos quais se formalizarem a concessão de crédito por parte do Banco do Nordeste do Brasil S.A. sem prejuízo da aplicação das sanções legais cabíveis, de natureza civil e penal.</w:t>
       </w:r>
-    </w:p>
-    <w:p>
-      <w:pPr>
-        <w:pStyle w:val="NormalWeb"/>
-        <w:jc w:val="both"/>
-      </w:pPr>
     </w:p>
     <w:p>
       <w:pPr>
@@ -603,12 +632,7 @@
       <w:pPr>
         <w:pStyle w:val="NormalWeb"/>
         <w:jc w:val="both"/>
-        <w:rPr>
-          <w:sz w:val="22"/>
-          <w:szCs w:val="22"/>
-        </w:rPr>
-      </w:pPr>
-      <w:proofErr w:type="gramStart"/>
+      </w:pPr>
       <w:r>
         <w:rPr>
           <w:sz w:val="22"/>
@@ -623,13 +647,19 @@
         </w:rPr>
         <w:t>x</w:t>
       </w:r>
-      <w:proofErr w:type="gramEnd"/>
-      <w:r>
-        <w:rPr>
-          <w:sz w:val="22"/>
-          <w:szCs w:val="22"/>
-        </w:rPr>
-        <w:t xml:space="preserve"> )   Para todos os fins de direito, inclusive o do inciso V, § 3º, do art. 1º da Lei Complementar nº 105/2001 e dos </w:t>
+      <w:r>
+        <w:rPr>
+          <w:sz w:val="22"/>
+          <w:szCs w:val="22"/>
+        </w:rPr>
+        <w:t xml:space="preserve"> )   </w:t>
+      </w:r>
+      <w:r>
+        <w:rPr>
+          <w:sz w:val="22"/>
+          <w:szCs w:val="22"/>
+        </w:rPr>
+        <w:t xml:space="preserve">Para todos os fins de direito, inclusive o do inciso V, § 3º, do art. 1º da Lei Complementar nº 105/2001 e dos </w:t>
       </w:r>
       <w:proofErr w:type="spellStart"/>
       <w:r>
@@ -645,14 +675,16 @@
           <w:sz w:val="22"/>
           <w:szCs w:val="22"/>
         </w:rPr>
-        <w:t>. 7º, I e 8º, caput e § 4º, da Lei nº 13.709/2018, autoriza(m) o Banco do Nordeste do Brasil S.A., a fornecer à CAMED Administradora e Corretora de Seguros Ltda, CNPJ 07.202.740/0001-50, os dados e as informações necessárias à cotação, contratação e renovação de seguro dos nossos bens patrimoniais oferecidos em garantia em operações de crédito com o Banco do Nordeste, ressalvando, entretanto, que futura obrigação sua de contratar ou renovar seguro desses bens poderá ser cumprida por intermédio dessa ou de outra corretora de sua conveniência.</w:t>
-      </w:r>
-    </w:p>
-    <w:p>
-      <w:pPr>
-        <w:pStyle w:val="NormalWeb"/>
-        <w:jc w:val="both"/>
-      </w:pPr>
+        <w:t xml:space="preserve">. 7º, I e 8º, caput e § 4º, da Lei nº 13.709/2018, autoriza(m) o Banco do Nordeste do Brasil S.A., a fornecer à CAMED Administradora e Corretora de Seguros Ltda, CNPJ </w:t>
+      </w:r>
+      <w:r>
+        <w:rPr>
+          <w:sz w:val="22"/>
+          <w:szCs w:val="22"/>
+        </w:rPr>
+        <w:lastRenderedPageBreak/>
+        <w:t>07.202.740/0001-50, os dados e as informações necessárias à cotação, contratação e renovação de seguro dos nossos bens patrimoniais oferecidos em garantia em operações de crédito com o Banco do Nordeste, ressalvando, entretanto, que futura obrigação sua de contratar ou renovar seguro desses bens poderá ser cumprida por intermédio dessa ou de outra corretora de sua conveniência.</w:t>
+      </w:r>
     </w:p>
     <w:p>
       <w:pPr>
@@ -674,7 +706,6 @@
         <w:pStyle w:val="NormalWeb"/>
         <w:jc w:val="both"/>
       </w:pPr>
-      <w:proofErr w:type="gramStart"/>
       <w:r>
         <w:rPr>
           <w:sz w:val="22"/>
@@ -689,13 +720,19 @@
         </w:rPr>
         <w:t>x</w:t>
       </w:r>
-      <w:proofErr w:type="gramEnd"/>
-      <w:r>
-        <w:rPr>
-          <w:sz w:val="22"/>
-          <w:szCs w:val="22"/>
-        </w:rPr>
-        <w:t xml:space="preserve"> )   Na qualidade de beneficiário(a) de financiamento com recursos do Fundo Constitucional de Financiamento do Nordeste (FNE), </w:t>
+      <w:r>
+        <w:rPr>
+          <w:sz w:val="22"/>
+          <w:szCs w:val="22"/>
+        </w:rPr>
+        <w:t xml:space="preserve"> )   </w:t>
+      </w:r>
+      <w:r>
+        <w:rPr>
+          <w:sz w:val="22"/>
+          <w:szCs w:val="22"/>
+        </w:rPr>
+        <w:t xml:space="preserve">Na qualidade de beneficiário(a) de financiamento com recursos do Fundo Constitucional de Financiamento do Nordeste (FNE), </w:t>
       </w:r>
       <w:r>
         <w:rPr>
@@ -719,21 +756,19 @@
         <w:pStyle w:val="NormalWeb"/>
         <w:jc w:val="both"/>
       </w:pPr>
-      <w:proofErr w:type="gramStart"/>
-      <w:r>
-        <w:rPr>
-          <w:sz w:val="22"/>
-          <w:szCs w:val="22"/>
-        </w:rPr>
-        <w:t>(  )</w:t>
-      </w:r>
-      <w:proofErr w:type="gramEnd"/>
-      <w:r>
-        <w:rPr>
-          <w:sz w:val="22"/>
-          <w:szCs w:val="22"/>
-        </w:rPr>
-        <w:t xml:space="preserve">   Na qualidade de beneficiário(a) de financiamento com recursos do Fundo Constitucional de Financiamento do Nordeste (FNE), </w:t>
+      <w:r>
+        <w:rPr>
+          <w:sz w:val="22"/>
+          <w:szCs w:val="22"/>
+        </w:rPr>
+        <w:t xml:space="preserve">(  )   </w:t>
+      </w:r>
+      <w:r>
+        <w:rPr>
+          <w:sz w:val="22"/>
+          <w:szCs w:val="22"/>
+        </w:rPr>
+        <w:t xml:space="preserve">Na qualidade de beneficiário(a) de financiamento com recursos do Fundo Constitucional de Financiamento do Nordeste (FNE), </w:t>
       </w:r>
       <w:r>
         <w:rPr>
@@ -773,21 +808,12 @@
         <w:pStyle w:val="NormalWeb"/>
         <w:jc w:val="both"/>
       </w:pPr>
-      <w:proofErr w:type="gramStart"/>
-      <w:r>
-        <w:rPr>
-          <w:sz w:val="22"/>
-          <w:szCs w:val="22"/>
-        </w:rPr>
-        <w:t>(  )</w:t>
-      </w:r>
-      <w:proofErr w:type="gramEnd"/>
-      <w:r>
-        <w:rPr>
-          <w:sz w:val="22"/>
-          <w:szCs w:val="22"/>
-        </w:rPr>
-        <w:t>   Na qualidade de beneficiário(a) de financiamento com recursos do Fundo Constitucional de Financiamento do Nordeste (FNE), e de controlador(a) da empresa (</w:t>
+      <w:r>
+        <w:rPr>
+          <w:sz w:val="22"/>
+          <w:szCs w:val="22"/>
+        </w:rPr>
+        <w:t>(  )   Na qualidade de beneficiário(a) de financiamento com recursos do Fundo Constitucional de Financiamento do Nordeste (FNE), e de controlador(a) da empresa (</w:t>
       </w:r>
       <w:r>
         <w:rPr>
@@ -1032,21 +1058,12 @@
         <w:pStyle w:val="NormalWeb"/>
         <w:jc w:val="both"/>
       </w:pPr>
-      <w:proofErr w:type="gramStart"/>
-      <w:r>
-        <w:rPr>
-          <w:sz w:val="22"/>
-          <w:szCs w:val="22"/>
-        </w:rPr>
-        <w:t>(  )</w:t>
-      </w:r>
-      <w:proofErr w:type="gramEnd"/>
-      <w:r>
-        <w:rPr>
-          <w:sz w:val="22"/>
-          <w:szCs w:val="22"/>
-        </w:rPr>
-        <w:t>   Na qualidade de controlador(a) da empresa (</w:t>
+      <w:r>
+        <w:rPr>
+          <w:sz w:val="22"/>
+          <w:szCs w:val="22"/>
+        </w:rPr>
+        <w:t>(  )   Na qualidade de controlador(a) da empresa (</w:t>
       </w:r>
       <w:r>
         <w:rPr>
@@ -1149,26 +1166,13 @@
       <w:pPr>
         <w:pStyle w:val="NormalWeb"/>
         <w:jc w:val="both"/>
-        <w:rPr>
-          <w:sz w:val="22"/>
-          <w:szCs w:val="22"/>
-        </w:rPr>
-      </w:pPr>
-      <w:proofErr w:type="gramStart"/>
-      <w:r>
-        <w:rPr>
-          <w:sz w:val="22"/>
-          <w:szCs w:val="22"/>
-        </w:rPr>
-        <w:t>(  )</w:t>
-      </w:r>
-      <w:proofErr w:type="gramEnd"/>
-      <w:r>
-        <w:rPr>
-          <w:sz w:val="22"/>
-          <w:szCs w:val="22"/>
-        </w:rPr>
-        <w:t>   Na qualidade de controlador(a) da empresa (</w:t>
+      </w:pPr>
+      <w:r>
+        <w:rPr>
+          <w:sz w:val="22"/>
+          <w:szCs w:val="22"/>
+        </w:rPr>
+        <w:t>(  )   Na qualidade de controlador(a) da empresa (</w:t>
       </w:r>
       <w:r>
         <w:rPr>
@@ -1224,7 +1228,6 @@
           <w:sz w:val="22"/>
           <w:szCs w:val="22"/>
         </w:rPr>
-        <w:lastRenderedPageBreak/>
         <w:t>xx.xxx.xxx</w:t>
       </w:r>
       <w:proofErr w:type="spellEnd"/>
@@ -1303,12 +1306,6 @@
     <w:p>
       <w:pPr>
         <w:pStyle w:val="NormalWeb"/>
-        <w:jc w:val="both"/>
-      </w:pPr>
-    </w:p>
-    <w:p>
-      <w:pPr>
-        <w:pStyle w:val="NormalWeb"/>
         <w:jc w:val="center"/>
       </w:pPr>
       <w:r>
@@ -1342,7 +1339,6 @@
         <w:t>chk_reneg_nao</w:t>
       </w:r>
       <w:proofErr w:type="spellEnd"/>
-      <w:proofErr w:type="gramStart"/>
       <w:r>
         <w:rPr>
           <w:sz w:val="22"/>
@@ -1357,39 +1353,18 @@
         </w:rPr>
         <w:t xml:space="preserve">   </w:t>
       </w:r>
-      <w:proofErr w:type="gramEnd"/>
-      <w:r>
-        <w:rPr>
-          <w:sz w:val="22"/>
-          <w:szCs w:val="22"/>
-        </w:rPr>
-        <w:t xml:space="preserve">Não responde(m) por nenhuma operação de crédito rural para investimento renegociada nos termos </w:t>
-      </w:r>
-      <w:proofErr w:type="gramStart"/>
-      <w:r>
-        <w:rPr>
-          <w:sz w:val="22"/>
-          <w:szCs w:val="22"/>
-        </w:rPr>
-        <w:t>do artigos</w:t>
-      </w:r>
-      <w:proofErr w:type="gramEnd"/>
-      <w:r>
-        <w:rPr>
-          <w:sz w:val="22"/>
-          <w:szCs w:val="22"/>
-        </w:rPr>
-        <w:t xml:space="preserve"> 15, 29 ou 30 da Medida Provisória nº 432 de 27/05/2008 e nos termos dos artigos 15, 29 ou 30 da Lei nº 11.775 de 17/09/2008, regulamentados, respectivamente, pelas Resoluções nº 3.578 e nº 3.573, ambas de 29/05/2008, do Conselho Monetário Nacional.</w:t>
-      </w:r>
-    </w:p>
-    <w:p>
-      <w:pPr>
-        <w:pStyle w:val="NormalWeb"/>
-        <w:jc w:val="both"/>
-        <w:rPr>
-          <w:sz w:val="22"/>
-          <w:szCs w:val="22"/>
-        </w:rPr>
+      <w:r>
+        <w:rPr>
+          <w:sz w:val="22"/>
+          <w:szCs w:val="22"/>
+        </w:rPr>
+        <w:t>Não responde(m) por nenhuma operação de crédito rural para investimento renegociada nos termos do artigos 15, 29 ou 30 da Medida Provisória nº 432 de 27/05/2008 e nos termos dos artigos 15, 29 ou 30 da Lei nº 11.775 de 17/09/2008, regulamentados, respectivamente, pelas Resoluções nº 3.578 e nº 3.573, ambas de 29/05/2008, do Conselho Monetário Nacional.</w:t>
+      </w:r>
+    </w:p>
+    <w:p>
+      <w:pPr>
+        <w:pStyle w:val="NormalWeb"/>
+        <w:jc w:val="both"/>
       </w:pPr>
       <w:r>
         <w:rPr>
@@ -1407,7 +1382,6 @@
         <w:t>chk_reneg_pagas</w:t>
       </w:r>
       <w:proofErr w:type="spellEnd"/>
-      <w:proofErr w:type="gramStart"/>
       <w:r>
         <w:rPr>
           <w:sz w:val="22"/>
@@ -1420,15 +1394,7 @@
           <w:sz w:val="22"/>
           <w:szCs w:val="22"/>
         </w:rPr>
-        <w:t xml:space="preserve">   </w:t>
-      </w:r>
-      <w:proofErr w:type="gramEnd"/>
-      <w:r>
-        <w:rPr>
-          <w:sz w:val="22"/>
-          <w:szCs w:val="22"/>
-        </w:rPr>
-        <w:t xml:space="preserve">Já amortizou(aram) integralmente as prestações vencidas no ano de </w:t>
+        <w:t xml:space="preserve">   Já amortizou(aram) integralmente as prestações vencidas no ano de </w:t>
       </w:r>
       <w:r>
         <w:rPr>
@@ -1444,30 +1410,16 @@
           <w:sz w:val="22"/>
           <w:szCs w:val="22"/>
         </w:rPr>
-        <w:t xml:space="preserve"> da operação de crédito rural para investimento renegociada nos termos </w:t>
-      </w:r>
-      <w:proofErr w:type="gramStart"/>
-      <w:r>
-        <w:rPr>
-          <w:sz w:val="22"/>
-          <w:szCs w:val="22"/>
-        </w:rPr>
-        <w:t>do artigos</w:t>
-      </w:r>
-      <w:proofErr w:type="gramEnd"/>
-      <w:r>
-        <w:rPr>
-          <w:sz w:val="22"/>
-          <w:szCs w:val="22"/>
-        </w:rPr>
-        <w:t xml:space="preserve"> 15, 29 ou 30 da Medida Provisória nº 432 de 27/05/2008 e nos termos dos artigos 15, 29 ou 30 da Lei nº 11.775 de 17/09/2008, regulamentados, respectivamente, pelas Resoluções nº 3.578 e nº 3.573, ambas de 29/05/2008, do Conselho Monetário Nacional.</w:t>
-      </w:r>
-    </w:p>
-    <w:p>
-      <w:pPr>
-        <w:pStyle w:val="NormalWeb"/>
-        <w:jc w:val="both"/>
-      </w:pPr>
+        <w:t xml:space="preserve"> da operação de crédito rural para investimento renegociada nos termos do artigos 15, 29 ou 30 da Medida Provisória nº 432 de 27/05/2008 e nos </w:t>
+      </w:r>
+      <w:r>
+        <w:rPr>
+          <w:sz w:val="22"/>
+          <w:szCs w:val="22"/>
+        </w:rPr>
+        <w:lastRenderedPageBreak/>
+        <w:t>termos dos artigos 15, 29 ou 30 da Lei nº 11.775 de 17/09/2008, regulamentados, respectivamente, pelas Resoluções nº 3.578 e nº 3.573, ambas de 29/05/2008, do Conselho Monetário Nacional.</w:t>
+      </w:r>
     </w:p>
     <w:p>
       <w:pPr>
@@ -1488,12 +1440,7 @@
       <w:pPr>
         <w:pStyle w:val="NormalWeb"/>
         <w:jc w:val="both"/>
-        <w:rPr>
-          <w:sz w:val="22"/>
-          <w:szCs w:val="22"/>
-        </w:rPr>
-      </w:pPr>
-      <w:proofErr w:type="gramStart"/>
+      </w:pPr>
       <w:r>
         <w:rPr>
           <w:sz w:val="22"/>
@@ -1508,20 +1455,20 @@
         </w:rPr>
         <w:t>x</w:t>
       </w:r>
-      <w:proofErr w:type="gramEnd"/>
-      <w:r>
-        <w:rPr>
-          <w:sz w:val="22"/>
-          <w:szCs w:val="22"/>
-        </w:rPr>
-        <w:t xml:space="preserve"> )   Não transitará em vias públicas com o trator ou os demais aparelhos automotores destinados a arrastar maquinaria de qualquer natureza ou executar trabalhos de construção ou de pavimentação adquiridos por meio do financiamento do Banco do Nordeste do Brasil S/A.</w:t>
-      </w:r>
-    </w:p>
-    <w:p>
-      <w:pPr>
-        <w:pStyle w:val="NormalWeb"/>
-        <w:jc w:val="both"/>
-      </w:pPr>
+      <w:r>
+        <w:rPr>
+          <w:sz w:val="22"/>
+          <w:szCs w:val="22"/>
+        </w:rPr>
+        <w:t xml:space="preserve"> )   </w:t>
+      </w:r>
+      <w:r>
+        <w:rPr>
+          <w:sz w:val="22"/>
+          <w:szCs w:val="22"/>
+        </w:rPr>
+        <w:t>Não transitará em vias públicas com o trator ou os demais aparelhos automotores destinados a arrastar maquinaria de qualquer natureza ou executar trabalhos de construção ou de pavimentação adquiridos por meio do financiamento do Banco do Nordeste do Brasil S/A.</w:t>
+      </w:r>
     </w:p>
     <w:p>
       <w:pPr>
@@ -1535,9 +1482,300 @@
           <w:sz w:val="22"/>
           <w:szCs w:val="22"/>
         </w:rPr>
-        <w:t xml:space="preserve">Declaração de Não Contribuinte à Previdência Social </w:t>
-      </w:r>
-      <w:proofErr w:type="gramStart"/>
+        <w:br/>
+        <w:t>Declaração de Não Contribuinte à Previdência Social como Empregador</w:t>
+      </w:r>
+    </w:p>
+    <w:p>
+      <w:pPr>
+        <w:pStyle w:val="NormalWeb"/>
+        <w:jc w:val="both"/>
+      </w:pPr>
+      <w:r>
+        <w:rPr>
+          <w:sz w:val="22"/>
+          <w:szCs w:val="22"/>
+        </w:rPr>
+        <w:t>({</w:t>
+      </w:r>
+      <w:proofErr w:type="spellStart"/>
+      <w:r>
+        <w:rPr>
+          <w:sz w:val="22"/>
+          <w:szCs w:val="22"/>
+        </w:rPr>
+        <w:t>chk_prev_rur</w:t>
+      </w:r>
+      <w:proofErr w:type="spellEnd"/>
+      <w:r>
+        <w:rPr>
+          <w:sz w:val="22"/>
+          <w:szCs w:val="22"/>
+        </w:rPr>
+        <w:t>})</w:t>
+      </w:r>
+      <w:r>
+        <w:rPr>
+          <w:sz w:val="22"/>
+          <w:szCs w:val="22"/>
+        </w:rPr>
+        <w:t>   Não se constitui em empresário registrado na junta comercial, na forma do Código Civil, bem como declara que, com relação ao(s) imóvel(</w:t>
+      </w:r>
+      <w:proofErr w:type="spellStart"/>
+      <w:r>
+        <w:rPr>
+          <w:sz w:val="22"/>
+          <w:szCs w:val="22"/>
+        </w:rPr>
+        <w:t>is</w:t>
+      </w:r>
+      <w:proofErr w:type="spellEnd"/>
+      <w:r>
+        <w:rPr>
+          <w:sz w:val="22"/>
+          <w:szCs w:val="22"/>
+        </w:rPr>
+        <w:t>):</w:t>
+      </w:r>
+    </w:p>
+    <w:p>
+      <w:pPr>
+        <w:pStyle w:val="NormalWeb"/>
+        <w:jc w:val="both"/>
+        <w:rPr>
+          <w:sz w:val="22"/>
+          <w:szCs w:val="22"/>
+        </w:rPr>
+      </w:pPr>
+      <w:r>
+        <w:rPr>
+          <w:sz w:val="22"/>
+          <w:szCs w:val="22"/>
+        </w:rPr>
+        <w:t>{#imoveis}</w:t>
+      </w:r>
+    </w:p>
+    <w:p>
+      <w:pPr>
+        <w:pStyle w:val="NormalWeb"/>
+        <w:jc w:val="both"/>
+        <w:rPr>
+          <w:sz w:val="22"/>
+          <w:szCs w:val="22"/>
+        </w:rPr>
+      </w:pPr>
+      <w:r>
+        <w:rPr>
+          <w:sz w:val="22"/>
+          <w:szCs w:val="22"/>
+        </w:rPr>
+        <w:t>- ({</w:t>
+      </w:r>
+      <w:proofErr w:type="spellStart"/>
+      <w:r>
+        <w:rPr>
+          <w:sz w:val="22"/>
+          <w:szCs w:val="22"/>
+        </w:rPr>
+        <w:t>idx</w:t>
+      </w:r>
+      <w:proofErr w:type="spellEnd"/>
+      <w:r>
+        <w:rPr>
+          <w:sz w:val="22"/>
+          <w:szCs w:val="22"/>
+        </w:rPr>
+        <w:t>}) imóvel denominado {nome}, localizado no município de {cidade} - {estado}, objeto da matrícula nº {matricula};</w:t>
+      </w:r>
+    </w:p>
+    <w:p>
+      <w:pPr>
+        <w:pStyle w:val="NormalWeb"/>
+        <w:jc w:val="both"/>
+        <w:rPr>
+          <w:sz w:val="22"/>
+          <w:szCs w:val="22"/>
+        </w:rPr>
+      </w:pPr>
+      <w:r>
+        <w:rPr>
+          <w:sz w:val="22"/>
+          <w:szCs w:val="22"/>
+        </w:rPr>
+        <w:t>{/</w:t>
+      </w:r>
+      <w:proofErr w:type="spellStart"/>
+      <w:r>
+        <w:rPr>
+          <w:sz w:val="22"/>
+          <w:szCs w:val="22"/>
+        </w:rPr>
+        <w:t>imoveis</w:t>
+      </w:r>
+      <w:proofErr w:type="spellEnd"/>
+      <w:r>
+        <w:rPr>
+          <w:sz w:val="22"/>
+          <w:szCs w:val="22"/>
+        </w:rPr>
+        <w:t>}</w:t>
+      </w:r>
+    </w:p>
+    <w:p>
+      <w:pPr>
+        <w:pStyle w:val="NormalWeb"/>
+        <w:jc w:val="both"/>
+        <w:rPr>
+          <w:sz w:val="22"/>
+          <w:szCs w:val="22"/>
+        </w:rPr>
+      </w:pPr>
+      <w:r>
+        <w:rPr>
+          <w:sz w:val="22"/>
+          <w:szCs w:val="22"/>
+        </w:rPr>
+        <w:t>Não é nem nunca foi contribuinte da Previdência Social na condição de empregador, por não manter nem ter mantido a seu serviço segurado(s) empregado(s) ou trabalhador(es) avulso(s) nesta(s) propriedade(s) rural(</w:t>
+      </w:r>
+      <w:proofErr w:type="spellStart"/>
+      <w:r>
+        <w:rPr>
+          <w:sz w:val="22"/>
+          <w:szCs w:val="22"/>
+        </w:rPr>
+        <w:t>is</w:t>
+      </w:r>
+      <w:proofErr w:type="spellEnd"/>
+      <w:r>
+        <w:rPr>
+          <w:sz w:val="22"/>
+          <w:szCs w:val="22"/>
+        </w:rPr>
+        <w:t>).</w:t>
+      </w:r>
+    </w:p>
+    <w:p>
+      <w:pPr>
+        <w:pStyle w:val="NormalWeb"/>
+        <w:jc w:val="both"/>
+      </w:pPr>
+      <w:r>
+        <w:rPr>
+          <w:sz w:val="22"/>
+          <w:szCs w:val="22"/>
+        </w:rPr>
+        <w:t>Declara, ainda, que, não comercializa a produção por ele obtida no(s) referido(s) imóvel(</w:t>
+      </w:r>
+      <w:proofErr w:type="spellStart"/>
+      <w:r>
+        <w:rPr>
+          <w:sz w:val="22"/>
+          <w:szCs w:val="22"/>
+        </w:rPr>
+        <w:t>is</w:t>
+      </w:r>
+      <w:proofErr w:type="spellEnd"/>
+      <w:r>
+        <w:rPr>
+          <w:sz w:val="22"/>
+          <w:szCs w:val="22"/>
+        </w:rPr>
+        <w:t>) rural(</w:t>
+      </w:r>
+      <w:proofErr w:type="spellStart"/>
+      <w:r>
+        <w:rPr>
+          <w:sz w:val="22"/>
+          <w:szCs w:val="22"/>
+        </w:rPr>
+        <w:t>is</w:t>
+      </w:r>
+      <w:proofErr w:type="spellEnd"/>
+      <w:r>
+        <w:rPr>
+          <w:sz w:val="22"/>
+          <w:szCs w:val="22"/>
+        </w:rPr>
+        <w:t>) com consumidor pessoa física, no varejo; nem com adquirente pessoa física, não produtor rural, para venda no varejo a consumidor pessoa física; nem com outro produtor rural pessoa física; nem com outro segurado especial; nem com empresa adquirente, consumidora, consignatária ou cooperativa; nem comercializou a referida produção, até 12/12/2001, com adquirente domiciliado no exterior (exportação).</w:t>
+      </w:r>
+    </w:p>
+    <w:p>
+      <w:pPr>
+        <w:pStyle w:val="NormalWeb"/>
+        <w:jc w:val="both"/>
+      </w:pPr>
+      <w:r>
+        <w:rPr>
+          <w:sz w:val="22"/>
+          <w:szCs w:val="22"/>
+        </w:rPr>
+        <w:t>({</w:t>
+      </w:r>
+      <w:proofErr w:type="spellStart"/>
+      <w:r>
+        <w:rPr>
+          <w:sz w:val="22"/>
+          <w:szCs w:val="22"/>
+        </w:rPr>
+        <w:t>chk_prev_nenhum</w:t>
+      </w:r>
+      <w:proofErr w:type="spellEnd"/>
+      <w:r>
+        <w:rPr>
+          <w:sz w:val="22"/>
+          <w:szCs w:val="22"/>
+        </w:rPr>
+        <w:t>})</w:t>
+      </w:r>
+      <w:r>
+        <w:rPr>
+          <w:sz w:val="22"/>
+          <w:szCs w:val="22"/>
+        </w:rPr>
+        <w:t>   Não se constitui em empresário registrado na Junta Comercial, na forma do Código Civil, bem como que não é, nem nunca foi, contribuinte da Previdência Social como empregador e que não mantém nem manteve a seu serviço segurados empregados ou trabalhadores avulsos, (e que não comercializa a própria produção, "se produtor rural ou segurado especial", na forma prevista no inciso I do art. 166 da Instrução Normativa RFB nº 971 de 13/11/2009 e respectivas alterações), não estando, portanto, sujeito(a) ao cumprimento da exigência de apresentação de Certidão Negativa de Débito - CND, a que alude o art. 10 da Lei nº 8.870, de 15/04/94, para fins de obtenção de crédito junto ao Banco do Nordeste.</w:t>
+      </w:r>
+    </w:p>
+    <w:p>
+      <w:pPr>
+        <w:pStyle w:val="NormalWeb"/>
+        <w:jc w:val="both"/>
+      </w:pPr>
+      <w:r>
+        <w:rPr>
+          <w:sz w:val="22"/>
+          <w:szCs w:val="22"/>
+        </w:rPr>
+        <w:t>({</w:t>
+      </w:r>
+      <w:proofErr w:type="spellStart"/>
+      <w:r>
+        <w:rPr>
+          <w:sz w:val="22"/>
+          <w:szCs w:val="22"/>
+        </w:rPr>
+        <w:t>chk_prev_emp</w:t>
+      </w:r>
+      <w:proofErr w:type="spellEnd"/>
+      <w:r>
+        <w:rPr>
+          <w:sz w:val="22"/>
+          <w:szCs w:val="22"/>
+        </w:rPr>
+        <w:t>})</w:t>
+      </w:r>
+      <w:r>
+        <w:rPr>
+          <w:sz w:val="22"/>
+          <w:szCs w:val="22"/>
+        </w:rPr>
+        <w:t>   Constitui-se em empresário registrado na Junta Comercial, na forma do Código Civil, e não é, nem nunca foi, contribuinte da Previdência Social como empregador e que não mantém nem manteve a seu serviço segurados empregados ou trabalhadores avulsos, (e que não comercializa a própria produção, "se produtor rural ou segurado especial", na forma prevista no inciso I do art. 166 da Instrução Normativa RFB nº 971 de 13/11/2009 e respectivas alterações), não estando, portanto, sujeito(a) ao cumprimento da exigência de apresentação de Certidão Negativa de Débito - CND, a que alude o art. 10 da Lei nº 8.870, de 15/04/94, para fins de obtenção de crédito junto ao Banco do Nordeste.</w:t>
+      </w:r>
+    </w:p>
+    <w:p>
+      <w:pPr>
+        <w:pStyle w:val="NormalWeb"/>
+        <w:jc w:val="center"/>
+      </w:pPr>
       <w:r>
         <w:rPr>
           <w:b/>
@@ -1545,21 +1783,22 @@
           <w:sz w:val="22"/>
           <w:szCs w:val="22"/>
         </w:rPr>
-        <w:t>como Empregador</w:t>
-      </w:r>
-      <w:proofErr w:type="gramEnd"/>
-    </w:p>
-    <w:p>
-      <w:pPr>
-        <w:pStyle w:val="NormalWeb"/>
-        <w:jc w:val="both"/>
-      </w:pPr>
-      <w:r>
-        <w:rPr>
-          <w:sz w:val="22"/>
-          <w:szCs w:val="22"/>
-        </w:rPr>
-        <w:t>({</w:t>
+        <w:br/>
+        <w:t>Declaração Referente ao Financiamento de Soja, Milho e Algodão</w:t>
+      </w:r>
+    </w:p>
+    <w:p>
+      <w:pPr>
+        <w:pStyle w:val="NormalWeb"/>
+        <w:jc w:val="both"/>
+      </w:pPr>
+      <w:r>
+        <w:rPr>
+          <w:sz w:val="22"/>
+          <w:szCs w:val="22"/>
+        </w:rPr>
+        <w:lastRenderedPageBreak/>
+        <w:t>(  )   Conhece e cumpre o que determina a legislação que regulamenta o uso de organismos geneticamente modificados (</w:t>
       </w:r>
       <w:proofErr w:type="spellStart"/>
       <w:r>
@@ -1567,308 +1806,107 @@
           <w:sz w:val="22"/>
           <w:szCs w:val="22"/>
         </w:rPr>
-        <w:t>chk_prev_rur</w:t>
+        <w:t>OGM´s</w:t>
       </w:r>
       <w:proofErr w:type="spellEnd"/>
-      <w:proofErr w:type="gramStart"/>
-      <w:r>
-        <w:rPr>
-          <w:sz w:val="22"/>
-          <w:szCs w:val="22"/>
-        </w:rPr>
-        <w:t>})</w:t>
-      </w:r>
-      <w:r>
-        <w:rPr>
-          <w:sz w:val="22"/>
-          <w:szCs w:val="22"/>
-        </w:rPr>
-        <w:t xml:space="preserve">   </w:t>
-      </w:r>
-      <w:proofErr w:type="gramEnd"/>
-      <w:r>
-        <w:rPr>
-          <w:sz w:val="22"/>
-          <w:szCs w:val="22"/>
-        </w:rPr>
-        <w:t>Não se constitui em empresário registrado na junta comercial, na forma do Código Civil, bem como declara que, com relação ao(s) imóvel(</w:t>
-      </w:r>
-      <w:proofErr w:type="spellStart"/>
-      <w:r>
-        <w:rPr>
-          <w:sz w:val="22"/>
-          <w:szCs w:val="22"/>
-        </w:rPr>
-        <w:t>is</w:t>
-      </w:r>
-      <w:proofErr w:type="spellEnd"/>
-      <w:r>
-        <w:rPr>
-          <w:sz w:val="22"/>
-          <w:szCs w:val="22"/>
-        </w:rPr>
-        <w:t>):</w:t>
-      </w:r>
-    </w:p>
-    <w:p>
-      <w:pPr>
-        <w:pStyle w:val="NormalWeb"/>
-        <w:jc w:val="both"/>
-        <w:rPr>
-          <w:sz w:val="22"/>
-          <w:szCs w:val="22"/>
-        </w:rPr>
-      </w:pPr>
-      <w:r>
-        <w:rPr>
-          <w:sz w:val="22"/>
-          <w:szCs w:val="22"/>
-        </w:rPr>
-        <w:t>{#imoveis}</w:t>
-      </w:r>
-    </w:p>
-    <w:p>
-      <w:pPr>
-        <w:pStyle w:val="NormalWeb"/>
-        <w:jc w:val="both"/>
-        <w:rPr>
-          <w:sz w:val="22"/>
-          <w:szCs w:val="22"/>
-        </w:rPr>
-      </w:pPr>
-      <w:r>
-        <w:rPr>
-          <w:sz w:val="22"/>
-          <w:szCs w:val="22"/>
-        </w:rPr>
-        <w:t>- ({</w:t>
-      </w:r>
-      <w:proofErr w:type="spellStart"/>
-      <w:r>
-        <w:rPr>
-          <w:sz w:val="22"/>
-          <w:szCs w:val="22"/>
-        </w:rPr>
-        <w:t>idx</w:t>
-      </w:r>
-      <w:proofErr w:type="spellEnd"/>
-      <w:r>
-        <w:rPr>
-          <w:sz w:val="22"/>
-          <w:szCs w:val="22"/>
-        </w:rPr>
-        <w:t>}) imóvel denominado {nome}, localizado no município de {cidade} - {estado}, objeto da matrícula nº {</w:t>
-      </w:r>
-      <w:proofErr w:type="gramStart"/>
-      <w:r>
-        <w:rPr>
-          <w:sz w:val="22"/>
-          <w:szCs w:val="22"/>
-        </w:rPr>
-        <w:t>matricula</w:t>
-      </w:r>
-      <w:proofErr w:type="gramEnd"/>
-      <w:r>
-        <w:rPr>
-          <w:sz w:val="22"/>
-          <w:szCs w:val="22"/>
-        </w:rPr>
-        <w:t>};</w:t>
-      </w:r>
-    </w:p>
-    <w:p>
-      <w:pPr>
-        <w:pStyle w:val="NormalWeb"/>
-        <w:jc w:val="both"/>
-        <w:rPr>
-          <w:sz w:val="22"/>
-          <w:szCs w:val="22"/>
-        </w:rPr>
-      </w:pPr>
-      <w:r>
-        <w:rPr>
-          <w:sz w:val="22"/>
-          <w:szCs w:val="22"/>
-        </w:rPr>
-        <w:t>{/</w:t>
-      </w:r>
-      <w:proofErr w:type="spellStart"/>
-      <w:r>
-        <w:rPr>
-          <w:sz w:val="22"/>
-          <w:szCs w:val="22"/>
-        </w:rPr>
-        <w:t>imoveis</w:t>
-      </w:r>
-      <w:proofErr w:type="spellEnd"/>
-      <w:r>
-        <w:rPr>
-          <w:sz w:val="22"/>
-          <w:szCs w:val="22"/>
-        </w:rPr>
-        <w:t>}</w:t>
-      </w:r>
-    </w:p>
-    <w:p>
-      <w:pPr>
-        <w:pStyle w:val="NormalWeb"/>
-        <w:jc w:val="both"/>
-        <w:rPr>
-          <w:sz w:val="22"/>
-          <w:szCs w:val="22"/>
-        </w:rPr>
-      </w:pPr>
-      <w:r>
-        <w:rPr>
-          <w:sz w:val="22"/>
-          <w:szCs w:val="22"/>
-        </w:rPr>
-        <w:t>Não é nem nunca foi contribuinte da Previdência Social na condição de empregador, por não manter nem ter mantido a seu serviço segurado(s) empregado(s) ou trabalhador(es) avulso(s) nesta(s) propriedade(s) rural(</w:t>
-      </w:r>
-      <w:proofErr w:type="spellStart"/>
-      <w:r>
-        <w:rPr>
-          <w:sz w:val="22"/>
-          <w:szCs w:val="22"/>
-        </w:rPr>
-        <w:t>is</w:t>
-      </w:r>
-      <w:proofErr w:type="spellEnd"/>
-      <w:r>
-        <w:rPr>
-          <w:sz w:val="22"/>
-          <w:szCs w:val="22"/>
-        </w:rPr>
-        <w:t>).</w:t>
-      </w:r>
-    </w:p>
-    <w:p>
-      <w:pPr>
-        <w:pStyle w:val="NormalWeb"/>
-        <w:jc w:val="both"/>
-      </w:pPr>
-      <w:r>
-        <w:rPr>
-          <w:sz w:val="22"/>
-          <w:szCs w:val="22"/>
-        </w:rPr>
-        <w:t>Declara, ainda, que, não comercializa a produção por ele obtida no(s) referido(s) imóvel(</w:t>
-      </w:r>
-      <w:proofErr w:type="spellStart"/>
-      <w:r>
-        <w:rPr>
-          <w:sz w:val="22"/>
-          <w:szCs w:val="22"/>
-        </w:rPr>
-        <w:t>is</w:t>
-      </w:r>
-      <w:proofErr w:type="spellEnd"/>
-      <w:r>
-        <w:rPr>
-          <w:sz w:val="22"/>
-          <w:szCs w:val="22"/>
-        </w:rPr>
-        <w:t>) rural(</w:t>
-      </w:r>
-      <w:proofErr w:type="spellStart"/>
-      <w:r>
-        <w:rPr>
-          <w:sz w:val="22"/>
-          <w:szCs w:val="22"/>
-        </w:rPr>
-        <w:t>is</w:t>
-      </w:r>
-      <w:proofErr w:type="spellEnd"/>
-      <w:r>
-        <w:rPr>
-          <w:sz w:val="22"/>
-          <w:szCs w:val="22"/>
-        </w:rPr>
-        <w:t>) com consumidor pessoa física, no varejo; nem com adquirente pessoa física, não produtor rural, para venda no varejo a consumidor pessoa física; nem com outro produtor rural pessoa física; nem com outro segurado especial; nem com empresa adquirente, consumidora, consignatária ou cooperativa; nem comercializou a referida produção, até 12/12/2001, com adquirente domiciliado no exterior (exportação).</w:t>
-      </w:r>
-    </w:p>
-    <w:p>
-      <w:pPr>
-        <w:pStyle w:val="NormalWeb"/>
-        <w:jc w:val="both"/>
-      </w:pPr>
-      <w:r>
-        <w:rPr>
-          <w:sz w:val="22"/>
-          <w:szCs w:val="22"/>
-        </w:rPr>
-        <w:lastRenderedPageBreak/>
-        <w:t>({</w:t>
-      </w:r>
-      <w:proofErr w:type="spellStart"/>
-      <w:r>
-        <w:rPr>
-          <w:sz w:val="22"/>
-          <w:szCs w:val="22"/>
-        </w:rPr>
-        <w:t>chk_prev_nenhum</w:t>
-      </w:r>
-      <w:proofErr w:type="spellEnd"/>
-      <w:r>
-        <w:rPr>
-          <w:sz w:val="22"/>
-          <w:szCs w:val="22"/>
-        </w:rPr>
-        <w:t>})</w:t>
-      </w:r>
-      <w:r>
-        <w:rPr>
-          <w:sz w:val="22"/>
-          <w:szCs w:val="22"/>
-        </w:rPr>
-        <w:t>   Não se constitui em empresário registrado na Junta Comercial, na forma do Código Civil, bem como que não é, nem nunca foi, contribuinte da Previdência Social como empregador e que não mantém nem manteve a seu serviço segurados empregados ou trabalhadores avulsos, (e que não comercializa a própria produção, "se produtor rural ou segurado especial", na forma prevista no inciso I do art. 166 da Instrução Normativa RFB nº 971 de 13/11/2009 e respectivas alterações), não estando, portanto, sujeito(a) ao cumprimento da exigência de apresentação de Certidão Negativa de Débito - CND, a que alude o art. 10 da Lei nº 8.870, de 15/04/94, para fins de obtenção de crédito junto ao Banco do Nordeste.</w:t>
-      </w:r>
-    </w:p>
-    <w:p>
-      <w:pPr>
-        <w:pStyle w:val="NormalWeb"/>
-        <w:jc w:val="both"/>
-        <w:rPr>
-          <w:sz w:val="22"/>
-          <w:szCs w:val="22"/>
-        </w:rPr>
-      </w:pPr>
-      <w:r>
-        <w:rPr>
-          <w:sz w:val="22"/>
-          <w:szCs w:val="22"/>
-        </w:rPr>
-        <w:t>({</w:t>
-      </w:r>
-      <w:proofErr w:type="spellStart"/>
-      <w:r>
-        <w:rPr>
-          <w:sz w:val="22"/>
-          <w:szCs w:val="22"/>
-        </w:rPr>
-        <w:t>chk_prev_emp</w:t>
-      </w:r>
-      <w:proofErr w:type="spellEnd"/>
-      <w:r>
-        <w:rPr>
-          <w:sz w:val="22"/>
-          <w:szCs w:val="22"/>
-        </w:rPr>
-        <w:t>})</w:t>
-      </w:r>
-      <w:r>
-        <w:rPr>
-          <w:sz w:val="22"/>
-          <w:szCs w:val="22"/>
-        </w:rPr>
-        <w:t>   Constitui-se em empresário registrado na Junta Comercial, na forma do Código Civil, e não é, nem nunca foi, contribuinte da Previdência Social como empregador e que não mantém nem manteve a seu serviço segurados empregados ou trabalhadores avulsos, (e que não comercializa a própria produção, "se produtor rural ou segurado especial", na forma prevista no inciso I do art. 166 da Instrução Normativa RFB nº 971 de 13/11/2009 e respectivas alterações), não estando, portanto, sujeito(a) ao cumprimento da exigência de apresentação de Certidão Negativa de Débito - CND, a que alude o art. 10 da Lei nº 8.870, de 15/04/94, para fins de obtenção de crédito junto ao Banco do Nordeste.</w:t>
-      </w:r>
-    </w:p>
-    <w:p>
-      <w:pPr>
-        <w:pStyle w:val="NormalWeb"/>
-        <w:jc w:val="both"/>
-      </w:pPr>
+      <w:r>
+        <w:rPr>
+          <w:sz w:val="22"/>
+          <w:szCs w:val="22"/>
+        </w:rPr>
+        <w:t>), comprometendo-se a somente utilizar sementes, insumos ou produtos originados a partir de cultivares transgênicas registradas e autorizadas para produção comercial no Brasil e que adoto as recomendações técnicas preconizadas pela Empresa Brasileira de Pesquisa Agropecuária (EMBRAPA).</w:t>
+      </w:r>
+    </w:p>
+    <w:p>
+      <w:pPr>
+        <w:pStyle w:val="NormalWeb"/>
+        <w:jc w:val="both"/>
+      </w:pPr>
+      <w:r>
+        <w:rPr>
+          <w:sz w:val="22"/>
+          <w:szCs w:val="22"/>
+        </w:rPr>
+        <w:t>(  )   Com relação ao custeio de algodão:</w:t>
+      </w:r>
+    </w:p>
+    <w:p>
+      <w:pPr>
+        <w:pStyle w:val="NormalWeb"/>
+        <w:jc w:val="both"/>
+      </w:pPr>
+      <w:r>
+        <w:rPr>
+          <w:sz w:val="22"/>
+          <w:szCs w:val="22"/>
+        </w:rPr>
+        <w:t>- São adotadas as práticas agrícolas e os orçamentos-padrão elaborados pela EMBRAPA, constantes no módulo de orçamentos do SEAP;</w:t>
+      </w:r>
+    </w:p>
+    <w:p>
+      <w:pPr>
+        <w:pStyle w:val="NormalWeb"/>
+        <w:jc w:val="both"/>
+      </w:pPr>
+      <w:r>
+        <w:rPr>
+          <w:sz w:val="22"/>
+          <w:szCs w:val="22"/>
+        </w:rPr>
+        <w:t>- Beneficia(m) a produção de algodão em usinas próprias, comercializando os produtos diretamente aos grandes compradores nacionais e internacionais, sem intermediação de empresa de beneficiamento;</w:t>
+      </w:r>
+    </w:p>
+    <w:p>
+      <w:pPr>
+        <w:pStyle w:val="NormalWeb"/>
+        <w:jc w:val="both"/>
+      </w:pPr>
+      <w:r>
+        <w:rPr>
+          <w:sz w:val="22"/>
+          <w:szCs w:val="22"/>
+        </w:rPr>
+        <w:t>- Obriga-se a seguir rigorosamente as recomendações técnicas da EMBRAPA para a cultura, transmitidas pelo responsável pela assistência técnica, com ênfase às práticas de combate ao bicudo;</w:t>
+      </w:r>
+    </w:p>
+    <w:p>
+      <w:pPr>
+        <w:pStyle w:val="NormalWeb"/>
+        <w:jc w:val="both"/>
+      </w:pPr>
+      <w:r>
+        <w:rPr>
+          <w:sz w:val="22"/>
+          <w:szCs w:val="22"/>
+        </w:rPr>
+        <w:t>- Os profissionais responsáveis pela assessoria empresarial e técnica participaram de treinamento específico sobre a cultura do algodão e estão aptos a transmitir as orientações da EMBRAPA a respeito do assunto;</w:t>
+      </w:r>
+    </w:p>
+    <w:p>
+      <w:pPr>
+        <w:pStyle w:val="NormalWeb"/>
+        <w:jc w:val="both"/>
+      </w:pPr>
+      <w:r>
+        <w:rPr>
+          <w:sz w:val="22"/>
+          <w:szCs w:val="22"/>
+        </w:rPr>
+        <w:t>- O pleito refere-se ao cultivo de algodão herbáceo, e foram eliminados totalmente os restos de cultura do algodão da safra anterior, pelos métodos de arranque completo, queima ou destruição e incorporação;</w:t>
+      </w:r>
+    </w:p>
+    <w:p>
+      <w:pPr>
+        <w:pStyle w:val="NormalWeb"/>
+        <w:jc w:val="both"/>
+      </w:pPr>
+      <w:r>
+        <w:rPr>
+          <w:sz w:val="22"/>
+          <w:szCs w:val="22"/>
+        </w:rPr>
+        <w:t>- Não realizará queimadas e nem desmatamentos nos imóveis objetos do presente financiamento.</w:t>
+      </w:r>
     </w:p>
     <w:p>
       <w:pPr>
@@ -1882,29 +1920,20 @@
           <w:sz w:val="22"/>
           <w:szCs w:val="22"/>
         </w:rPr>
-        <w:t>Declaração Referente ao Financiamento de Soja, Milho e Algodão</w:t>
-      </w:r>
-    </w:p>
-    <w:p>
-      <w:pPr>
-        <w:pStyle w:val="NormalWeb"/>
-        <w:jc w:val="both"/>
-      </w:pPr>
-      <w:proofErr w:type="gramStart"/>
-      <w:r>
-        <w:rPr>
-          <w:sz w:val="22"/>
-          <w:szCs w:val="22"/>
-        </w:rPr>
-        <w:t>(  )</w:t>
-      </w:r>
-      <w:proofErr w:type="gramEnd"/>
-      <w:r>
-        <w:rPr>
-          <w:sz w:val="22"/>
-          <w:szCs w:val="22"/>
-        </w:rPr>
-        <w:t>   Conhece e cumpre o que determina a legislação que regulamenta o uso de organismos geneticamente modificados (</w:t>
+        <w:t>Declaração de Suporte Forrageiro</w:t>
+      </w:r>
+    </w:p>
+    <w:p>
+      <w:pPr>
+        <w:pStyle w:val="NormalWeb"/>
+        <w:jc w:val="both"/>
+      </w:pPr>
+      <w:r>
+        <w:rPr>
+          <w:sz w:val="22"/>
+          <w:szCs w:val="22"/>
+        </w:rPr>
+        <w:t>({</w:t>
       </w:r>
       <w:proofErr w:type="spellStart"/>
       <w:r>
@@ -1912,7 +1941,7 @@
           <w:sz w:val="22"/>
           <w:szCs w:val="22"/>
         </w:rPr>
-        <w:t>OGM´s</w:t>
+        <w:t>chk_forr_sim</w:t>
       </w:r>
       <w:proofErr w:type="spellEnd"/>
       <w:r>
@@ -1920,178 +1949,6 @@
           <w:sz w:val="22"/>
           <w:szCs w:val="22"/>
         </w:rPr>
-        <w:t>), comprometendo-se a somente utilizar sementes, insumos ou produtos originados a partir de cultivares transgênicas registradas e autorizadas para produção comercial no Brasil e que adoto as recomendações técnicas preconizadas pela Empresa Brasileira de Pesquisa Agropecuária (EMBRAPA).</w:t>
-      </w:r>
-    </w:p>
-    <w:p>
-      <w:pPr>
-        <w:pStyle w:val="NormalWeb"/>
-        <w:jc w:val="both"/>
-      </w:pPr>
-      <w:proofErr w:type="gramStart"/>
-      <w:r>
-        <w:rPr>
-          <w:sz w:val="22"/>
-          <w:szCs w:val="22"/>
-        </w:rPr>
-        <w:t>(  )</w:t>
-      </w:r>
-      <w:proofErr w:type="gramEnd"/>
-      <w:r>
-        <w:rPr>
-          <w:sz w:val="22"/>
-          <w:szCs w:val="22"/>
-        </w:rPr>
-        <w:t>   Com relação ao custeio de algodão:</w:t>
-      </w:r>
-    </w:p>
-    <w:p>
-      <w:pPr>
-        <w:pStyle w:val="NormalWeb"/>
-        <w:jc w:val="both"/>
-      </w:pPr>
-      <w:r>
-        <w:rPr>
-          <w:sz w:val="22"/>
-          <w:szCs w:val="22"/>
-        </w:rPr>
-        <w:t xml:space="preserve">- São </w:t>
-      </w:r>
-      <w:proofErr w:type="gramStart"/>
-      <w:r>
-        <w:rPr>
-          <w:sz w:val="22"/>
-          <w:szCs w:val="22"/>
-        </w:rPr>
-        <w:t>adotadas</w:t>
-      </w:r>
-      <w:proofErr w:type="gramEnd"/>
-      <w:r>
-        <w:rPr>
-          <w:sz w:val="22"/>
-          <w:szCs w:val="22"/>
-        </w:rPr>
-        <w:t xml:space="preserve"> as práticas agrícolas e os orçamentos-padrão elaborados pela EMBRAPA, constantes no módulo de orçamentos do SEAP;</w:t>
-      </w:r>
-    </w:p>
-    <w:p>
-      <w:pPr>
-        <w:pStyle w:val="NormalWeb"/>
-        <w:jc w:val="both"/>
-      </w:pPr>
-      <w:r>
-        <w:rPr>
-          <w:sz w:val="22"/>
-          <w:szCs w:val="22"/>
-        </w:rPr>
-        <w:t>- Beneficia(m) a produção de algodão em usinas próprias, comercializando os produtos diretamente aos grandes compradores nacionais e internacionais, sem intermediação de empresa de beneficiamento;</w:t>
-      </w:r>
-    </w:p>
-    <w:p>
-      <w:pPr>
-        <w:pStyle w:val="NormalWeb"/>
-        <w:jc w:val="both"/>
-      </w:pPr>
-      <w:r>
-        <w:rPr>
-          <w:sz w:val="22"/>
-          <w:szCs w:val="22"/>
-        </w:rPr>
-        <w:t>- Obriga-se a seguir rigorosamente as recomendações técnicas da EMBRAPA para a cultura, transmitidas pelo responsável pela assistência técnica, com ênfase às práticas de combate ao bicudo;</w:t>
-      </w:r>
-    </w:p>
-    <w:p>
-      <w:pPr>
-        <w:pStyle w:val="NormalWeb"/>
-        <w:jc w:val="both"/>
-      </w:pPr>
-      <w:r>
-        <w:rPr>
-          <w:sz w:val="22"/>
-          <w:szCs w:val="22"/>
-        </w:rPr>
-        <w:t>- Os profissionais responsáveis pela assessoria empresarial e técnica participaram de treinamento específico sobre a cultura do algodão e estão aptos a transmitir as orientações da EMBRAPA a respeito do assunto;</w:t>
-      </w:r>
-    </w:p>
-    <w:p>
-      <w:pPr>
-        <w:pStyle w:val="NormalWeb"/>
-        <w:jc w:val="both"/>
-      </w:pPr>
-      <w:r>
-        <w:rPr>
-          <w:sz w:val="22"/>
-          <w:szCs w:val="22"/>
-        </w:rPr>
-        <w:t>- O pleito refere-se ao cultivo de algodão herbáceo, e foram eliminados totalmente os restos de cultura do algodão da safra anterior, pelos métodos de arranque completo, queima ou destruição e incorporação;</w:t>
-      </w:r>
-    </w:p>
-    <w:p>
-      <w:pPr>
-        <w:pStyle w:val="NormalWeb"/>
-        <w:jc w:val="both"/>
-        <w:rPr>
-          <w:sz w:val="22"/>
-          <w:szCs w:val="22"/>
-        </w:rPr>
-      </w:pPr>
-      <w:r>
-        <w:rPr>
-          <w:sz w:val="22"/>
-          <w:szCs w:val="22"/>
-        </w:rPr>
-        <w:t>- Não realizará queimadas e nem desmatamentos nos imóveis objetos do presente financiamento.</w:t>
-      </w:r>
-    </w:p>
-    <w:p>
-      <w:pPr>
-        <w:pStyle w:val="NormalWeb"/>
-        <w:jc w:val="both"/>
-      </w:pPr>
-    </w:p>
-    <w:p>
-      <w:pPr>
-        <w:pStyle w:val="NormalWeb"/>
-        <w:jc w:val="center"/>
-      </w:pPr>
-      <w:r>
-        <w:rPr>
-          <w:b/>
-          <w:bCs/>
-          <w:sz w:val="22"/>
-          <w:szCs w:val="22"/>
-        </w:rPr>
-        <w:lastRenderedPageBreak/>
-        <w:t>Declaração de Suporte Forrageiro</w:t>
-      </w:r>
-    </w:p>
-    <w:p>
-      <w:pPr>
-        <w:pStyle w:val="NormalWeb"/>
-        <w:jc w:val="both"/>
-      </w:pPr>
-      <w:r>
-        <w:rPr>
-          <w:sz w:val="22"/>
-          <w:szCs w:val="22"/>
-        </w:rPr>
-        <w:t>({</w:t>
-      </w:r>
-      <w:proofErr w:type="spellStart"/>
-      <w:r>
-        <w:rPr>
-          <w:sz w:val="22"/>
-          <w:szCs w:val="22"/>
-        </w:rPr>
-        <w:t>chk_forr_sim</w:t>
-      </w:r>
-      <w:proofErr w:type="spellEnd"/>
-      <w:proofErr w:type="gramStart"/>
-      <w:r>
-        <w:rPr>
-          <w:sz w:val="22"/>
-          <w:szCs w:val="22"/>
-        </w:rPr>
         <w:t>})</w:t>
       </w:r>
       <w:r>
@@ -2099,15 +1956,7 @@
           <w:sz w:val="22"/>
           <w:szCs w:val="22"/>
         </w:rPr>
-        <w:t xml:space="preserve">   </w:t>
-      </w:r>
-      <w:proofErr w:type="gramEnd"/>
-      <w:r>
-        <w:rPr>
-          <w:sz w:val="22"/>
-          <w:szCs w:val="22"/>
-        </w:rPr>
-        <w:t>Na(s) seguinte(s) propriedade(s), dispõe de suporte forrageiro e recursos hídricos necessários para apascentar os animais existentes e os que estão sendo adquiridos:</w:t>
+        <w:t>   Na(s) seguinte(s) propriedade(s), dispõe de suporte forrageiro e recursos hídricos necessários para apascentar os animais existentes e os que estão sendo adquiridos:</w:t>
       </w:r>
     </w:p>
     <w:tbl>
@@ -2128,9 +1977,9 @@
         <w:tblLook w:val="04A0" w:firstRow="1" w:lastRow="0" w:firstColumn="1" w:lastColumn="0" w:noHBand="0" w:noVBand="1"/>
       </w:tblPr>
       <w:tblGrid>
-        <w:gridCol w:w="3421"/>
-        <w:gridCol w:w="1597"/>
-        <w:gridCol w:w="3470"/>
+        <w:gridCol w:w="2803"/>
+        <w:gridCol w:w="2842"/>
+        <w:gridCol w:w="2843"/>
       </w:tblGrid>
       <w:tr>
         <w:tc>
@@ -2239,21 +2088,7 @@
               <w:rPr>
                 <w:rFonts w:ascii="Times New Roman" w:hAnsi="Times New Roman" w:cs="Times New Roman"/>
               </w:rPr>
-              <w:t>{#</w:t>
-            </w:r>
-            <w:proofErr w:type="gramStart"/>
-            <w:r>
-              <w:rPr>
-                <w:rFonts w:ascii="Times New Roman" w:hAnsi="Times New Roman" w:cs="Times New Roman"/>
-              </w:rPr>
-              <w:t>imoveis}{</w:t>
-            </w:r>
-            <w:proofErr w:type="gramEnd"/>
-            <w:r>
-              <w:rPr>
-                <w:rFonts w:ascii="Times New Roman" w:hAnsi="Times New Roman" w:cs="Times New Roman"/>
-              </w:rPr>
-              <w:t>nome}</w:t>
+              <w:t>{#imoveis}{nome}</w:t>
             </w:r>
           </w:p>
         </w:tc>
@@ -2282,7 +2117,7 @@
                 <w:bCs/>
                 <w:lang w:eastAsia="pt-BR"/>
               </w:rPr>
-              <w:t xml:space="preserve">{cidade} </w:t>
+              <w:t>{cidade} - {estado}</w:t>
             </w:r>
           </w:p>
         </w:tc>
@@ -2335,142 +2170,6 @@
         </w:tc>
       </w:tr>
     </w:tbl>
-    <w:p/>
-    <w:p>
-      <w:pPr>
-        <w:rPr>
-          <w:vanish/>
-        </w:rPr>
-      </w:pPr>
-    </w:p>
-    <w:p>
-      <w:pPr>
-        <w:pStyle w:val="NormalWeb"/>
-        <w:jc w:val="center"/>
-      </w:pPr>
-      <w:r>
-        <w:rPr>
-          <w:b/>
-          <w:bCs/>
-          <w:sz w:val="22"/>
-          <w:szCs w:val="22"/>
-        </w:rPr>
-        <w:t>Declaração de Não Ocorrência de Desmatamento Irregular após 22 de julho de 2008</w:t>
-      </w:r>
-    </w:p>
-    <w:p>
-      <w:pPr>
-        <w:pStyle w:val="NormalWeb"/>
-        <w:jc w:val="both"/>
-        <w:rPr>
-          <w:sz w:val="22"/>
-          <w:szCs w:val="22"/>
-        </w:rPr>
-      </w:pPr>
-      <w:proofErr w:type="gramStart"/>
-      <w:r>
-        <w:rPr>
-          <w:sz w:val="22"/>
-          <w:szCs w:val="22"/>
-        </w:rPr>
-        <w:t>( </w:t>
-      </w:r>
-      <w:r>
-        <w:rPr>
-          <w:sz w:val="22"/>
-          <w:szCs w:val="22"/>
-        </w:rPr>
-        <w:t>x</w:t>
-      </w:r>
-      <w:proofErr w:type="gramEnd"/>
-      <w:r>
-        <w:rPr>
-          <w:sz w:val="22"/>
-          <w:szCs w:val="22"/>
-        </w:rPr>
-        <w:t xml:space="preserve"> )   </w:t>
-      </w:r>
-      <w:r>
-        <w:rPr>
-          <w:sz w:val="22"/>
-          <w:szCs w:val="22"/>
-        </w:rPr>
-        <w:t>A(s) atividade(s) ou empreendimento(s) em favor da(s) qual(</w:t>
-      </w:r>
-      <w:proofErr w:type="spellStart"/>
-      <w:r>
-        <w:rPr>
-          <w:sz w:val="22"/>
-          <w:szCs w:val="22"/>
-        </w:rPr>
-        <w:t>is</w:t>
-      </w:r>
-      <w:proofErr w:type="spellEnd"/>
-      <w:r>
-        <w:rPr>
-          <w:sz w:val="22"/>
-          <w:szCs w:val="22"/>
-        </w:rPr>
-        <w:t>) se postula a concessão de crédito, conforme</w:t>
-      </w:r>
-      <w:r>
-        <w:rPr>
-          <w:sz w:val="22"/>
-          <w:szCs w:val="22"/>
-        </w:rPr>
-        <w:t xml:space="preserve"> </w:t>
-      </w:r>
-      <w:r>
-        <w:rPr>
-          <w:sz w:val="22"/>
-          <w:szCs w:val="22"/>
-        </w:rPr>
-        <w:t>Carta Proposta, é desenvolvida em local(</w:t>
-      </w:r>
-      <w:proofErr w:type="spellStart"/>
-      <w:r>
-        <w:rPr>
-          <w:sz w:val="22"/>
-          <w:szCs w:val="22"/>
-        </w:rPr>
-        <w:t>is</w:t>
-      </w:r>
-      <w:proofErr w:type="spellEnd"/>
-      <w:r>
-        <w:rPr>
-          <w:sz w:val="22"/>
-          <w:szCs w:val="22"/>
-        </w:rPr>
-        <w:t>) que não foi (foram) irregularmente desmatado(s) após 22 de julho de</w:t>
-      </w:r>
-      <w:r>
-        <w:rPr>
-          <w:sz w:val="22"/>
-          <w:szCs w:val="22"/>
-        </w:rPr>
-        <w:t xml:space="preserve"> </w:t>
-      </w:r>
-      <w:r>
-        <w:rPr>
-          <w:sz w:val="22"/>
-          <w:szCs w:val="22"/>
-        </w:rPr>
-        <w:t>2008.</w:t>
-      </w:r>
-    </w:p>
-    <w:p>
-      <w:pPr>
-        <w:pStyle w:val="NormalWeb"/>
-        <w:jc w:val="both"/>
-      </w:pPr>
-      <w:r>
-        <w:rPr>
-          <w:sz w:val="22"/>
-          <w:szCs w:val="22"/>
-        </w:rPr>
-        <w:t>O declarante fica ainda ciente de que a falsidade das declarações ora prestadas poderá acarretar o vencimento antecipado do contrato, sem prejuízo da aplicação das sanções legais cabíveis.</w:t>
-      </w:r>
-    </w:p>
     <w:p>
       <w:pPr>
         <w:pStyle w:val="NormalWeb"/>
@@ -2626,7 +2325,12 @@
     </w:p>
     <w:p/>
     <w:sectPr>
-      <w:footerReference w:type="default" r:id="rId6"/>
+      <w:headerReference w:type="even" r:id="rId6"/>
+      <w:headerReference w:type="default" r:id="rId7"/>
+      <w:footerReference w:type="even" r:id="rId8"/>
+      <w:footerReference w:type="default" r:id="rId9"/>
+      <w:headerReference w:type="first" r:id="rId10"/>
+      <w:footerReference w:type="first" r:id="rId11"/>
       <w:pgSz w:w="11906" w:h="16838"/>
       <w:pgMar w:top="1417" w:right="1701" w:bottom="1417" w:left="1701" w:header="708" w:footer="708" w:gutter="0"/>
       <w:cols w:space="708"/>
@@ -2666,7 +2370,45 @@
   <w:p>
     <w:pPr>
       <w:pStyle w:val="Rodap"/>
+    </w:pPr>
+  </w:p>
+</w:ftr>
+</file>
+
+<file path=word/footer2.xml><?xml version="1.0" encoding="utf-8"?>
+<w:ftr xmlns:wpc="http://schemas.microsoft.com/office/word/2010/wordprocessingCanvas" xmlns:cx="http://schemas.microsoft.com/office/drawing/2014/chartex" xmlns:cx1="http://schemas.microsoft.com/office/drawing/2015/9/8/chartex" xmlns:cx2="http://schemas.microsoft.com/office/drawing/2015/10/21/chartex" xmlns:cx3="http://schemas.microsoft.com/office/drawing/2016/5/9/chartex" xmlns:cx4="http://schemas.microsoft.com/office/drawing/2016/5/10/chartex" xmlns:cx5="http://schemas.microsoft.com/office/drawing/2016/5/11/chartex" xmlns:cx6="http://schemas.microsoft.com/office/drawing/2016/5/12/chartex" xmlns:cx7="http://schemas.microsoft.com/office/drawing/2016/5/13/chartex" xmlns:cx8="http://schemas.microsoft.com/office/drawing/2016/5/14/chartex" xmlns:mc="http://schemas.openxmlformats.org/markup-compatibility/2006" xmlns:aink="http://schemas.microsoft.com/office/drawing/2016/ink" xmlns:am3d="http://schemas.microsoft.com/office/drawing/2017/model3d" xmlns:o="urn:schemas-microsoft-com:office:office" xmlns:oel="http://schemas.microsoft.com/office/2019/extlst" xmlns:r="http://schemas.openxmlformats.org/officeDocument/2006/relationships" xmlns:m="http://schemas.openxmlformats.org/officeDocument/2006/math" xmlns:v="urn:schemas-microsoft-com:vml" xmlns:wp14="http://schemas.microsoft.com/office/word/2010/wordprocessingDrawing" xmlns:wp="http://schemas.openxmlformats.org/drawingml/2006/wordprocessingDrawing" xmlns:w10="urn:schemas-microsoft-com:office:word" xmlns:w="http://schemas.openxmlformats.org/wordprocessingml/2006/main" xmlns:w14="http://schemas.microsoft.com/office/word/2010/wordml" xmlns:w15="http://schemas.microsoft.com/office/word/2012/wordml" xmlns:w16cex="http://schemas.microsoft.com/office/word/2018/wordml/cex" xmlns:w16cid="http://schemas.microsoft.com/office/word/2016/wordml/cid" xmlns:w16="http://schemas.microsoft.com/office/word/2018/wordml" xmlns:w16du="http://schemas.microsoft.com/office/word/2023/wordml/word16du" xmlns:w16sdtdh="http://schemas.microsoft.com/office/word/2020/wordml/sdtdatahash" xmlns:w16sdtfl="http://schemas.microsoft.com/office/word/2024/wordml/sdtformatlock" xmlns:w16se="http://schemas.microsoft.com/office/word/2015/wordml/symex" xmlns:wpg="http://schemas.microsoft.com/office/word/2010/wordprocessingGroup" xmlns:wpi="http://schemas.microsoft.com/office/word/2010/wordprocessingInk" xmlns:wne="http://schemas.microsoft.com/office/word/2006/wordml" xmlns:wps="http://schemas.microsoft.com/office/word/2010/wordprocessingShape" mc:Ignorable="w14 w15 w16se w16cid w16 w16cex w16sdtdh w16sdtfl w16du wp14">
+  <w:p>
+    <w:pPr>
+      <w:pStyle w:val="Rodap"/>
       <w:jc w:val="center"/>
+    </w:pPr>
+    <w:r>
+      <w:rPr>
+        <w:rFonts w:ascii="Calibri" w:hAnsi="Calibri" w:cs="Calibri"/>
+        <w:color w:val="000000"/>
+        <w:sz w:val="20"/>
+        <w:szCs w:val="20"/>
+      </w:rPr>
+      <w:t> Este documento está classificado como:</w:t>
+    </w:r>
+    <w:r>
+      <w:rPr>
+        <w:rFonts w:ascii="Calibri" w:hAnsi="Calibri" w:cs="Calibri"/>
+        <w:color w:val="0000FC"/>
+        <w:sz w:val="20"/>
+        <w:szCs w:val="20"/>
+      </w:rPr>
+      <w:t xml:space="preserve"> Interno</w:t>
+    </w:r>
+  </w:p>
+</w:ftr>
+</file>
+
+<file path=word/footer3.xml><?xml version="1.0" encoding="utf-8"?>
+<w:ftr xmlns:wpc="http://schemas.microsoft.com/office/word/2010/wordprocessingCanvas" xmlns:cx="http://schemas.microsoft.com/office/drawing/2014/chartex" xmlns:cx1="http://schemas.microsoft.com/office/drawing/2015/9/8/chartex" xmlns:cx2="http://schemas.microsoft.com/office/drawing/2015/10/21/chartex" xmlns:cx3="http://schemas.microsoft.com/office/drawing/2016/5/9/chartex" xmlns:cx4="http://schemas.microsoft.com/office/drawing/2016/5/10/chartex" xmlns:cx5="http://schemas.microsoft.com/office/drawing/2016/5/11/chartex" xmlns:cx6="http://schemas.microsoft.com/office/drawing/2016/5/12/chartex" xmlns:cx7="http://schemas.microsoft.com/office/drawing/2016/5/13/chartex" xmlns:cx8="http://schemas.microsoft.com/office/drawing/2016/5/14/chartex" xmlns:mc="http://schemas.openxmlformats.org/markup-compatibility/2006" xmlns:aink="http://schemas.microsoft.com/office/drawing/2016/ink" xmlns:am3d="http://schemas.microsoft.com/office/drawing/2017/model3d" xmlns:o="urn:schemas-microsoft-com:office:office" xmlns:oel="http://schemas.microsoft.com/office/2019/extlst" xmlns:r="http://schemas.openxmlformats.org/officeDocument/2006/relationships" xmlns:m="http://schemas.openxmlformats.org/officeDocument/2006/math" xmlns:v="urn:schemas-microsoft-com:vml" xmlns:wp14="http://schemas.microsoft.com/office/word/2010/wordprocessingDrawing" xmlns:wp="http://schemas.openxmlformats.org/drawingml/2006/wordprocessingDrawing" xmlns:w10="urn:schemas-microsoft-com:office:word" xmlns:w="http://schemas.openxmlformats.org/wordprocessingml/2006/main" xmlns:w14="http://schemas.microsoft.com/office/word/2010/wordml" xmlns:w15="http://schemas.microsoft.com/office/word/2012/wordml" xmlns:w16cex="http://schemas.microsoft.com/office/word/2018/wordml/cex" xmlns:w16cid="http://schemas.microsoft.com/office/word/2016/wordml/cid" xmlns:w16="http://schemas.microsoft.com/office/word/2018/wordml" xmlns:w16du="http://schemas.microsoft.com/office/word/2023/wordml/word16du" xmlns:w16sdtdh="http://schemas.microsoft.com/office/word/2020/wordml/sdtdatahash" xmlns:w16sdtfl="http://schemas.microsoft.com/office/word/2024/wordml/sdtformatlock" xmlns:w16se="http://schemas.microsoft.com/office/word/2015/wordml/symex" xmlns:wpg="http://schemas.microsoft.com/office/word/2010/wordprocessingGroup" xmlns:wpi="http://schemas.microsoft.com/office/word/2010/wordprocessingInk" xmlns:wne="http://schemas.microsoft.com/office/word/2006/wordml" xmlns:wps="http://schemas.microsoft.com/office/word/2010/wordprocessingShape" mc:Ignorable="w14 w15 w16se w16cid w16 w16cex w16sdtdh w16sdtfl w16du wp14">
+  <w:p>
+    <w:pPr>
+      <w:pStyle w:val="Rodap"/>
     </w:pPr>
   </w:p>
 </w:ftr>
@@ -2695,6 +2437,36 @@
     </w:p>
   </w:footnote>
 </w:footnotes>
+</file>
+
+<file path=word/header1.xml><?xml version="1.0" encoding="utf-8"?>
+<w:hdr xmlns:wpc="http://schemas.microsoft.com/office/word/2010/wordprocessingCanvas" xmlns:cx="http://schemas.microsoft.com/office/drawing/2014/chartex" xmlns:cx1="http://schemas.microsoft.com/office/drawing/2015/9/8/chartex" xmlns:cx2="http://schemas.microsoft.com/office/drawing/2015/10/21/chartex" xmlns:cx3="http://schemas.microsoft.com/office/drawing/2016/5/9/chartex" xmlns:cx4="http://schemas.microsoft.com/office/drawing/2016/5/10/chartex" xmlns:cx5="http://schemas.microsoft.com/office/drawing/2016/5/11/chartex" xmlns:cx6="http://schemas.microsoft.com/office/drawing/2016/5/12/chartex" xmlns:cx7="http://schemas.microsoft.com/office/drawing/2016/5/13/chartex" xmlns:cx8="http://schemas.microsoft.com/office/drawing/2016/5/14/chartex" xmlns:mc="http://schemas.openxmlformats.org/markup-compatibility/2006" xmlns:aink="http://schemas.microsoft.com/office/drawing/2016/ink" xmlns:am3d="http://schemas.microsoft.com/office/drawing/2017/model3d" xmlns:o="urn:schemas-microsoft-com:office:office" xmlns:oel="http://schemas.microsoft.com/office/2019/extlst" xmlns:r="http://schemas.openxmlformats.org/officeDocument/2006/relationships" xmlns:m="http://schemas.openxmlformats.org/officeDocument/2006/math" xmlns:v="urn:schemas-microsoft-com:vml" xmlns:wp14="http://schemas.microsoft.com/office/word/2010/wordprocessingDrawing" xmlns:wp="http://schemas.openxmlformats.org/drawingml/2006/wordprocessingDrawing" xmlns:w10="urn:schemas-microsoft-com:office:word" xmlns:w="http://schemas.openxmlformats.org/wordprocessingml/2006/main" xmlns:w14="http://schemas.microsoft.com/office/word/2010/wordml" xmlns:w15="http://schemas.microsoft.com/office/word/2012/wordml" xmlns:w16cex="http://schemas.microsoft.com/office/word/2018/wordml/cex" xmlns:w16cid="http://schemas.microsoft.com/office/word/2016/wordml/cid" xmlns:w16="http://schemas.microsoft.com/office/word/2018/wordml" xmlns:w16du="http://schemas.microsoft.com/office/word/2023/wordml/word16du" xmlns:w16sdtdh="http://schemas.microsoft.com/office/word/2020/wordml/sdtdatahash" xmlns:w16sdtfl="http://schemas.microsoft.com/office/word/2024/wordml/sdtformatlock" xmlns:w16se="http://schemas.microsoft.com/office/word/2015/wordml/symex" xmlns:wpg="http://schemas.microsoft.com/office/word/2010/wordprocessingGroup" xmlns:wpi="http://schemas.microsoft.com/office/word/2010/wordprocessingInk" xmlns:wne="http://schemas.microsoft.com/office/word/2006/wordml" xmlns:wps="http://schemas.microsoft.com/office/word/2010/wordprocessingShape" mc:Ignorable="w14 w15 w16se w16cid w16 w16cex w16sdtdh w16sdtfl w16du wp14">
+  <w:p>
+    <w:pPr>
+      <w:pStyle w:val="Cabealho"/>
+    </w:pPr>
+  </w:p>
+</w:hdr>
+</file>
+
+<file path=word/header2.xml><?xml version="1.0" encoding="utf-8"?>
+<w:hdr xmlns:wpc="http://schemas.microsoft.com/office/word/2010/wordprocessingCanvas" xmlns:cx="http://schemas.microsoft.com/office/drawing/2014/chartex" xmlns:cx1="http://schemas.microsoft.com/office/drawing/2015/9/8/chartex" xmlns:cx2="http://schemas.microsoft.com/office/drawing/2015/10/21/chartex" xmlns:cx3="http://schemas.microsoft.com/office/drawing/2016/5/9/chartex" xmlns:cx4="http://schemas.microsoft.com/office/drawing/2016/5/10/chartex" xmlns:cx5="http://schemas.microsoft.com/office/drawing/2016/5/11/chartex" xmlns:cx6="http://schemas.microsoft.com/office/drawing/2016/5/12/chartex" xmlns:cx7="http://schemas.microsoft.com/office/drawing/2016/5/13/chartex" xmlns:cx8="http://schemas.microsoft.com/office/drawing/2016/5/14/chartex" xmlns:mc="http://schemas.openxmlformats.org/markup-compatibility/2006" xmlns:aink="http://schemas.microsoft.com/office/drawing/2016/ink" xmlns:am3d="http://schemas.microsoft.com/office/drawing/2017/model3d" xmlns:o="urn:schemas-microsoft-com:office:office" xmlns:oel="http://schemas.microsoft.com/office/2019/extlst" xmlns:r="http://schemas.openxmlformats.org/officeDocument/2006/relationships" xmlns:m="http://schemas.openxmlformats.org/officeDocument/2006/math" xmlns:v="urn:schemas-microsoft-com:vml" xmlns:wp14="http://schemas.microsoft.com/office/word/2010/wordprocessingDrawing" xmlns:wp="http://schemas.openxmlformats.org/drawingml/2006/wordprocessingDrawing" xmlns:w10="urn:schemas-microsoft-com:office:word" xmlns:w="http://schemas.openxmlformats.org/wordprocessingml/2006/main" xmlns:w14="http://schemas.microsoft.com/office/word/2010/wordml" xmlns:w15="http://schemas.microsoft.com/office/word/2012/wordml" xmlns:w16cex="http://schemas.microsoft.com/office/word/2018/wordml/cex" xmlns:w16cid="http://schemas.microsoft.com/office/word/2016/wordml/cid" xmlns:w16="http://schemas.microsoft.com/office/word/2018/wordml" xmlns:w16du="http://schemas.microsoft.com/office/word/2023/wordml/word16du" xmlns:w16sdtdh="http://schemas.microsoft.com/office/word/2020/wordml/sdtdatahash" xmlns:w16sdtfl="http://schemas.microsoft.com/office/word/2024/wordml/sdtformatlock" xmlns:w16se="http://schemas.microsoft.com/office/word/2015/wordml/symex" xmlns:wpg="http://schemas.microsoft.com/office/word/2010/wordprocessingGroup" xmlns:wpi="http://schemas.microsoft.com/office/word/2010/wordprocessingInk" xmlns:wne="http://schemas.microsoft.com/office/word/2006/wordml" xmlns:wps="http://schemas.microsoft.com/office/word/2010/wordprocessingShape" mc:Ignorable="w14 w15 w16se w16cid w16 w16cex w16sdtdh w16sdtfl w16du wp14">
+  <w:p>
+    <w:pPr>
+      <w:pStyle w:val="Cabealho"/>
+    </w:pPr>
+  </w:p>
+</w:hdr>
+</file>
+
+<file path=word/header3.xml><?xml version="1.0" encoding="utf-8"?>
+<w:hdr xmlns:wpc="http://schemas.microsoft.com/office/word/2010/wordprocessingCanvas" xmlns:cx="http://schemas.microsoft.com/office/drawing/2014/chartex" xmlns:cx1="http://schemas.microsoft.com/office/drawing/2015/9/8/chartex" xmlns:cx2="http://schemas.microsoft.com/office/drawing/2015/10/21/chartex" xmlns:cx3="http://schemas.microsoft.com/office/drawing/2016/5/9/chartex" xmlns:cx4="http://schemas.microsoft.com/office/drawing/2016/5/10/chartex" xmlns:cx5="http://schemas.microsoft.com/office/drawing/2016/5/11/chartex" xmlns:cx6="http://schemas.microsoft.com/office/drawing/2016/5/12/chartex" xmlns:cx7="http://schemas.microsoft.com/office/drawing/2016/5/13/chartex" xmlns:cx8="http://schemas.microsoft.com/office/drawing/2016/5/14/chartex" xmlns:mc="http://schemas.openxmlformats.org/markup-compatibility/2006" xmlns:aink="http://schemas.microsoft.com/office/drawing/2016/ink" xmlns:am3d="http://schemas.microsoft.com/office/drawing/2017/model3d" xmlns:o="urn:schemas-microsoft-com:office:office" xmlns:oel="http://schemas.microsoft.com/office/2019/extlst" xmlns:r="http://schemas.openxmlformats.org/officeDocument/2006/relationships" xmlns:m="http://schemas.openxmlformats.org/officeDocument/2006/math" xmlns:v="urn:schemas-microsoft-com:vml" xmlns:wp14="http://schemas.microsoft.com/office/word/2010/wordprocessingDrawing" xmlns:wp="http://schemas.openxmlformats.org/drawingml/2006/wordprocessingDrawing" xmlns:w10="urn:schemas-microsoft-com:office:word" xmlns:w="http://schemas.openxmlformats.org/wordprocessingml/2006/main" xmlns:w14="http://schemas.microsoft.com/office/word/2010/wordml" xmlns:w15="http://schemas.microsoft.com/office/word/2012/wordml" xmlns:w16cex="http://schemas.microsoft.com/office/word/2018/wordml/cex" xmlns:w16cid="http://schemas.microsoft.com/office/word/2016/wordml/cid" xmlns:w16="http://schemas.microsoft.com/office/word/2018/wordml" xmlns:w16du="http://schemas.microsoft.com/office/word/2023/wordml/word16du" xmlns:w16sdtdh="http://schemas.microsoft.com/office/word/2020/wordml/sdtdatahash" xmlns:w16sdtfl="http://schemas.microsoft.com/office/word/2024/wordml/sdtformatlock" xmlns:w16se="http://schemas.microsoft.com/office/word/2015/wordml/symex" xmlns:wpg="http://schemas.microsoft.com/office/word/2010/wordprocessingGroup" xmlns:wpi="http://schemas.microsoft.com/office/word/2010/wordprocessingInk" xmlns:wne="http://schemas.microsoft.com/office/word/2006/wordml" xmlns:wps="http://schemas.microsoft.com/office/word/2010/wordprocessingShape" mc:Ignorable="w14 w15 w16se w16cid w16 w16cex w16sdtdh w16sdtfl w16du wp14">
+  <w:p>
+    <w:pPr>
+      <w:pStyle w:val="Cabealho"/>
+    </w:pPr>
+  </w:p>
+</w:hdr>
 </file>
 
 <file path=word/styles.xml><?xml version="1.0" encoding="utf-8"?>
@@ -3634,8 +3406,8 @@
   <w:style w:type="paragraph" w:styleId="NormalWeb">
     <w:name w:val="Normal (Web)"/>
     <w:basedOn w:val="Normal"/>
+    <w:link w:val="NormalWebChar"/>
     <w:uiPriority w:val="99"/>
-    <w:semiHidden/>
     <w:unhideWhenUsed/>
     <w:rsid w:val="00D20E14"/>
     <w:pPr>
@@ -3767,6 +3539,18 @@
     <w:link w:val="Rodap"/>
     <w:uiPriority w:val="99"/>
     <w:rsid w:val="00F04F81"/>
+  </w:style>
+  <w:style w:type="character" w:customStyle="1" w:styleId="NormalWebChar">
+    <w:name w:val="Normal (Web) Char"/>
+    <w:link w:val="NormalWeb"/>
+    <w:uiPriority w:val="99"/>
+    <w:rsid w:val="00374697"/>
+    <w:rPr>
+      <w:rFonts w:ascii="Times New Roman" w:eastAsia="Times New Roman" w:hAnsi="Times New Roman" w:cs="Times New Roman"/>
+      <w:sz w:val="24"/>
+      <w:szCs w:val="24"/>
+      <w:lang w:eastAsia="pt-BR"/>
+    </w:rPr>
   </w:style>
 </w:styles>
 </file>

</xml_diff>